<commit_message>
updated com protoc doc
added ideas from white board and reformatted the doc a bit
</commit_message>
<xml_diff>
--- a/srDesign_STBMFCommunicationProtocol.docx
+++ b/srDesign_STBMFCommunicationProtocol.docx
@@ -10,8 +10,6 @@
         </w:pBdr>
         <w:jc w:val="right"/>
       </w:pPr>
-      <w:bookmarkStart w:id="0" w:name="_GoBack"/>
-      <w:bookmarkEnd w:id="0"/>
       <w:r>
         <w:rPr>
           <w:noProof/>
@@ -32,7 +30,7 @@
                     <pic:cNvPicPr/>
                   </pic:nvPicPr>
                   <pic:blipFill>
-                    <a:blip r:embed="rId6">
+                    <a:blip r:embed="rId7">
                       <a:extLst>
                         <a:ext uri="{28A0092B-C50C-407E-A947-70E740481C1C}">
                           <a14:useLocalDpi xmlns:a14="http://schemas.microsoft.com/office/drawing/2010/main" val="0"/>
@@ -396,6 +394,30 @@
       <w:r>
         <w:t>-this document will explain the command link and data flow between hardware of the network</w:t>
       </w:r>
+      <w:r>
+        <w:t xml:space="preserve"> components (</w:t>
+      </w:r>
+      <w:proofErr w:type="spellStart"/>
+      <w:r>
+        <w:t>STB</w:t>
+      </w:r>
+      <w:proofErr w:type="gramStart"/>
+      <w:r>
+        <w:t>,vAPMAX</w:t>
+      </w:r>
+      <w:proofErr w:type="spellEnd"/>
+      <w:proofErr w:type="gramEnd"/>
+      <w:r>
+        <w:t xml:space="preserve">, </w:t>
+      </w:r>
+      <w:proofErr w:type="spellStart"/>
+      <w:r>
+        <w:t>GameServer</w:t>
+      </w:r>
+      <w:proofErr w:type="spellEnd"/>
+      <w:r>
+        <w:t>)</w:t>
+      </w:r>
     </w:p>
     <w:p/>
     <w:p/>
@@ -404,11 +426,13 @@
       <w:pPr>
         <w:pStyle w:val="Heading1"/>
       </w:pPr>
-      <w:bookmarkStart w:id="1" w:name="_Toc337723027"/>
+      <w:bookmarkStart w:id="0" w:name="_Toc337723027"/>
+      <w:bookmarkStart w:id="1" w:name="_Toc338056899"/>
       <w:r>
         <w:lastRenderedPageBreak/>
         <w:t>Revision History</w:t>
       </w:r>
+      <w:bookmarkEnd w:id="0"/>
       <w:bookmarkEnd w:id="1"/>
     </w:p>
     <w:tbl>
@@ -1008,6 +1032,9 @@
         <w:p>
           <w:pPr>
             <w:pStyle w:val="TOCHeading"/>
+            <w:rPr>
+              <w:noProof/>
+            </w:rPr>
           </w:pPr>
           <w:r>
             <w:t>Table of Contents</w:t>
@@ -1029,16 +1056,17 @@
               <w:tab w:val="right" w:leader="dot" w:pos="9350"/>
             </w:tabs>
             <w:rPr>
+              <w:rFonts w:eastAsiaTheme="minorEastAsia"/>
               <w:noProof/>
             </w:rPr>
           </w:pPr>
-          <w:hyperlink w:anchor="_Toc337723028" w:history="1">
+          <w:hyperlink w:anchor="_Toc338056899" w:history="1">
             <w:r>
               <w:rPr>
                 <w:rStyle w:val="Hyperlink"/>
                 <w:noProof/>
               </w:rPr>
-              <w:t>Introduction</w:t>
+              <w:t>Revision History</w:t>
             </w:r>
             <w:r>
               <w:rPr>
@@ -1059,7 +1087,7 @@
                 <w:noProof/>
                 <w:webHidden/>
               </w:rPr>
-              <w:instrText xml:space="preserve"> PAGEREF _Toc337723028 \h </w:instrText>
+              <w:instrText xml:space="preserve"> PAGEREF _Toc338056899 \h </w:instrText>
             </w:r>
             <w:r>
               <w:rPr>
@@ -1079,7 +1107,7 @@
                 <w:noProof/>
                 <w:webHidden/>
               </w:rPr>
-              <w:t>3</w:t>
+              <w:t>2</w:t>
             </w:r>
             <w:r>
               <w:rPr>
@@ -1097,16 +1125,17 @@
               <w:tab w:val="right" w:leader="dot" w:pos="9350"/>
             </w:tabs>
             <w:rPr>
+              <w:rFonts w:eastAsiaTheme="minorEastAsia"/>
               <w:noProof/>
             </w:rPr>
           </w:pPr>
-          <w:hyperlink w:anchor="_Toc337723029" w:history="1">
+          <w:hyperlink w:anchor="_Toc338056900" w:history="1">
             <w:r>
               <w:rPr>
                 <w:rStyle w:val="Hyperlink"/>
                 <w:noProof/>
               </w:rPr>
-              <w:t>STB to APMAX</w:t>
+              <w:t>Introduction</w:t>
             </w:r>
             <w:r>
               <w:rPr>
@@ -1127,7 +1156,7 @@
                 <w:noProof/>
                 <w:webHidden/>
               </w:rPr>
-              <w:instrText xml:space="preserve"> PAGEREF _Toc337723029 \h </w:instrText>
+              <w:instrText xml:space="preserve"> PAGEREF _Toc338056900 \h </w:instrText>
             </w:r>
             <w:r>
               <w:rPr>
@@ -1165,16 +1194,17 @@
               <w:tab w:val="right" w:leader="dot" w:pos="9350"/>
             </w:tabs>
             <w:rPr>
+              <w:rFonts w:eastAsiaTheme="minorEastAsia"/>
               <w:noProof/>
             </w:rPr>
           </w:pPr>
-          <w:hyperlink w:anchor="_Toc337723030" w:history="1">
+          <w:hyperlink w:anchor="_Toc338056901" w:history="1">
             <w:r>
               <w:rPr>
                 <w:rStyle w:val="Hyperlink"/>
                 <w:noProof/>
               </w:rPr>
-              <w:t>APMAX to Game Server</w:t>
+              <w:t>System Communication Architecture</w:t>
             </w:r>
             <w:r>
               <w:rPr>
@@ -1195,7 +1225,7 @@
                 <w:noProof/>
                 <w:webHidden/>
               </w:rPr>
-              <w:instrText xml:space="preserve"> PAGEREF _Toc337723030 \h </w:instrText>
+              <w:instrText xml:space="preserve"> PAGEREF _Toc338056901 \h </w:instrText>
             </w:r>
             <w:r>
               <w:rPr>
@@ -1233,16 +1263,17 @@
               <w:tab w:val="right" w:leader="dot" w:pos="9350"/>
             </w:tabs>
             <w:rPr>
+              <w:rFonts w:eastAsiaTheme="minorEastAsia"/>
               <w:noProof/>
             </w:rPr>
           </w:pPr>
-          <w:hyperlink w:anchor="_Toc337723031" w:history="1">
+          <w:hyperlink w:anchor="_Toc338056902" w:history="1">
             <w:r>
               <w:rPr>
                 <w:rStyle w:val="Hyperlink"/>
                 <w:noProof/>
               </w:rPr>
-              <w:t>Game Server to APMAX</w:t>
+              <w:t>Communication Layers</w:t>
             </w:r>
             <w:r>
               <w:rPr>
@@ -1263,7 +1294,7 @@
                 <w:noProof/>
                 <w:webHidden/>
               </w:rPr>
-              <w:instrText xml:space="preserve"> PAGEREF _Toc337723031 \h </w:instrText>
+              <w:instrText xml:space="preserve"> PAGEREF _Toc338056902 \h </w:instrText>
             </w:r>
             <w:r>
               <w:rPr>
@@ -1283,7 +1314,766 @@
                 <w:noProof/>
                 <w:webHidden/>
               </w:rPr>
-              <w:t>3</w:t>
+              <w:t>4</w:t>
+            </w:r>
+            <w:r>
+              <w:rPr>
+                <w:noProof/>
+                <w:webHidden/>
+              </w:rPr>
+              <w:fldChar w:fldCharType="end"/>
+            </w:r>
+          </w:hyperlink>
+        </w:p>
+        <w:p>
+          <w:pPr>
+            <w:pStyle w:val="TOC2"/>
+            <w:tabs>
+              <w:tab w:val="right" w:leader="dot" w:pos="9350"/>
+            </w:tabs>
+            <w:rPr>
+              <w:rFonts w:eastAsiaTheme="minorEastAsia"/>
+              <w:noProof/>
+            </w:rPr>
+          </w:pPr>
+          <w:hyperlink w:anchor="_Toc338056903" w:history="1">
+            <w:r>
+              <w:rPr>
+                <w:rStyle w:val="Hyperlink"/>
+                <w:noProof/>
+              </w:rPr>
+              <w:t>STB</w:t>
+            </w:r>
+            <w:r>
+              <w:rPr>
+                <w:noProof/>
+                <w:webHidden/>
+              </w:rPr>
+              <w:tab/>
+            </w:r>
+            <w:r>
+              <w:rPr>
+                <w:noProof/>
+                <w:webHidden/>
+              </w:rPr>
+              <w:fldChar w:fldCharType="begin"/>
+            </w:r>
+            <w:r>
+              <w:rPr>
+                <w:noProof/>
+                <w:webHidden/>
+              </w:rPr>
+              <w:instrText xml:space="preserve"> PAGEREF _Toc338056903 \h </w:instrText>
+            </w:r>
+            <w:r>
+              <w:rPr>
+                <w:noProof/>
+                <w:webHidden/>
+              </w:rPr>
+            </w:r>
+            <w:r>
+              <w:rPr>
+                <w:noProof/>
+                <w:webHidden/>
+              </w:rPr>
+              <w:fldChar w:fldCharType="separate"/>
+            </w:r>
+            <w:r>
+              <w:rPr>
+                <w:noProof/>
+                <w:webHidden/>
+              </w:rPr>
+              <w:t>4</w:t>
+            </w:r>
+            <w:r>
+              <w:rPr>
+                <w:noProof/>
+                <w:webHidden/>
+              </w:rPr>
+              <w:fldChar w:fldCharType="end"/>
+            </w:r>
+          </w:hyperlink>
+        </w:p>
+        <w:p>
+          <w:pPr>
+            <w:pStyle w:val="TOC3"/>
+            <w:tabs>
+              <w:tab w:val="right" w:leader="dot" w:pos="9350"/>
+            </w:tabs>
+            <w:rPr>
+              <w:rFonts w:eastAsiaTheme="minorEastAsia"/>
+              <w:noProof/>
+            </w:rPr>
+          </w:pPr>
+          <w:hyperlink w:anchor="_Toc338056904" w:history="1">
+            <w:r>
+              <w:rPr>
+                <w:rStyle w:val="Hyperlink"/>
+                <w:noProof/>
+              </w:rPr>
+              <w:t>UDP Receiver</w:t>
+            </w:r>
+            <w:r>
+              <w:rPr>
+                <w:noProof/>
+                <w:webHidden/>
+              </w:rPr>
+              <w:tab/>
+            </w:r>
+            <w:r>
+              <w:rPr>
+                <w:noProof/>
+                <w:webHidden/>
+              </w:rPr>
+              <w:fldChar w:fldCharType="begin"/>
+            </w:r>
+            <w:r>
+              <w:rPr>
+                <w:noProof/>
+                <w:webHidden/>
+              </w:rPr>
+              <w:instrText xml:space="preserve"> PAGEREF _Toc338056904 \h </w:instrText>
+            </w:r>
+            <w:r>
+              <w:rPr>
+                <w:noProof/>
+                <w:webHidden/>
+              </w:rPr>
+            </w:r>
+            <w:r>
+              <w:rPr>
+                <w:noProof/>
+                <w:webHidden/>
+              </w:rPr>
+              <w:fldChar w:fldCharType="separate"/>
+            </w:r>
+            <w:r>
+              <w:rPr>
+                <w:noProof/>
+                <w:webHidden/>
+              </w:rPr>
+              <w:t>4</w:t>
+            </w:r>
+            <w:r>
+              <w:rPr>
+                <w:noProof/>
+                <w:webHidden/>
+              </w:rPr>
+              <w:fldChar w:fldCharType="end"/>
+            </w:r>
+          </w:hyperlink>
+        </w:p>
+        <w:p>
+          <w:pPr>
+            <w:pStyle w:val="TOC3"/>
+            <w:tabs>
+              <w:tab w:val="right" w:leader="dot" w:pos="9350"/>
+            </w:tabs>
+            <w:rPr>
+              <w:rFonts w:eastAsiaTheme="minorEastAsia"/>
+              <w:noProof/>
+            </w:rPr>
+          </w:pPr>
+          <w:hyperlink w:anchor="_Toc338056905" w:history="1">
+            <w:r>
+              <w:rPr>
+                <w:rStyle w:val="Hyperlink"/>
+                <w:noProof/>
+              </w:rPr>
+              <w:t>UDP Sender</w:t>
+            </w:r>
+            <w:r>
+              <w:rPr>
+                <w:noProof/>
+                <w:webHidden/>
+              </w:rPr>
+              <w:tab/>
+            </w:r>
+            <w:r>
+              <w:rPr>
+                <w:noProof/>
+                <w:webHidden/>
+              </w:rPr>
+              <w:fldChar w:fldCharType="begin"/>
+            </w:r>
+            <w:r>
+              <w:rPr>
+                <w:noProof/>
+                <w:webHidden/>
+              </w:rPr>
+              <w:instrText xml:space="preserve"> PAGEREF _Toc338056905 \h </w:instrText>
+            </w:r>
+            <w:r>
+              <w:rPr>
+                <w:noProof/>
+                <w:webHidden/>
+              </w:rPr>
+            </w:r>
+            <w:r>
+              <w:rPr>
+                <w:noProof/>
+                <w:webHidden/>
+              </w:rPr>
+              <w:fldChar w:fldCharType="separate"/>
+            </w:r>
+            <w:r>
+              <w:rPr>
+                <w:noProof/>
+                <w:webHidden/>
+              </w:rPr>
+              <w:t>4</w:t>
+            </w:r>
+            <w:r>
+              <w:rPr>
+                <w:noProof/>
+                <w:webHidden/>
+              </w:rPr>
+              <w:fldChar w:fldCharType="end"/>
+            </w:r>
+          </w:hyperlink>
+        </w:p>
+        <w:p>
+          <w:pPr>
+            <w:pStyle w:val="TOC2"/>
+            <w:tabs>
+              <w:tab w:val="right" w:leader="dot" w:pos="9350"/>
+            </w:tabs>
+            <w:rPr>
+              <w:rFonts w:eastAsiaTheme="minorEastAsia"/>
+              <w:noProof/>
+            </w:rPr>
+          </w:pPr>
+          <w:hyperlink w:anchor="_Toc338056906" w:history="1">
+            <w:r>
+              <w:rPr>
+                <w:rStyle w:val="Hyperlink"/>
+                <w:noProof/>
+              </w:rPr>
+              <w:t>vAPMAX</w:t>
+            </w:r>
+            <w:r>
+              <w:rPr>
+                <w:noProof/>
+                <w:webHidden/>
+              </w:rPr>
+              <w:tab/>
+            </w:r>
+            <w:r>
+              <w:rPr>
+                <w:noProof/>
+                <w:webHidden/>
+              </w:rPr>
+              <w:fldChar w:fldCharType="begin"/>
+            </w:r>
+            <w:r>
+              <w:rPr>
+                <w:noProof/>
+                <w:webHidden/>
+              </w:rPr>
+              <w:instrText xml:space="preserve"> PAGEREF _Toc338056906 \h </w:instrText>
+            </w:r>
+            <w:r>
+              <w:rPr>
+                <w:noProof/>
+                <w:webHidden/>
+              </w:rPr>
+            </w:r>
+            <w:r>
+              <w:rPr>
+                <w:noProof/>
+                <w:webHidden/>
+              </w:rPr>
+              <w:fldChar w:fldCharType="separate"/>
+            </w:r>
+            <w:r>
+              <w:rPr>
+                <w:noProof/>
+                <w:webHidden/>
+              </w:rPr>
+              <w:t>4</w:t>
+            </w:r>
+            <w:r>
+              <w:rPr>
+                <w:noProof/>
+                <w:webHidden/>
+              </w:rPr>
+              <w:fldChar w:fldCharType="end"/>
+            </w:r>
+          </w:hyperlink>
+        </w:p>
+        <w:p>
+          <w:pPr>
+            <w:pStyle w:val="TOC3"/>
+            <w:tabs>
+              <w:tab w:val="right" w:leader="dot" w:pos="9350"/>
+            </w:tabs>
+            <w:rPr>
+              <w:rFonts w:eastAsiaTheme="minorEastAsia"/>
+              <w:noProof/>
+            </w:rPr>
+          </w:pPr>
+          <w:hyperlink w:anchor="_Toc338056907" w:history="1">
+            <w:r>
+              <w:rPr>
+                <w:rStyle w:val="Hyperlink"/>
+                <w:noProof/>
+              </w:rPr>
+              <w:t>UDP Receiver</w:t>
+            </w:r>
+            <w:r>
+              <w:rPr>
+                <w:noProof/>
+                <w:webHidden/>
+              </w:rPr>
+              <w:tab/>
+            </w:r>
+            <w:r>
+              <w:rPr>
+                <w:noProof/>
+                <w:webHidden/>
+              </w:rPr>
+              <w:fldChar w:fldCharType="begin"/>
+            </w:r>
+            <w:r>
+              <w:rPr>
+                <w:noProof/>
+                <w:webHidden/>
+              </w:rPr>
+              <w:instrText xml:space="preserve"> PAGEREF _Toc338056907 \h </w:instrText>
+            </w:r>
+            <w:r>
+              <w:rPr>
+                <w:noProof/>
+                <w:webHidden/>
+              </w:rPr>
+            </w:r>
+            <w:r>
+              <w:rPr>
+                <w:noProof/>
+                <w:webHidden/>
+              </w:rPr>
+              <w:fldChar w:fldCharType="separate"/>
+            </w:r>
+            <w:r>
+              <w:rPr>
+                <w:noProof/>
+                <w:webHidden/>
+              </w:rPr>
+              <w:t>4</w:t>
+            </w:r>
+            <w:r>
+              <w:rPr>
+                <w:noProof/>
+                <w:webHidden/>
+              </w:rPr>
+              <w:fldChar w:fldCharType="end"/>
+            </w:r>
+          </w:hyperlink>
+        </w:p>
+        <w:p>
+          <w:pPr>
+            <w:pStyle w:val="TOC3"/>
+            <w:tabs>
+              <w:tab w:val="right" w:leader="dot" w:pos="9350"/>
+            </w:tabs>
+            <w:rPr>
+              <w:rFonts w:eastAsiaTheme="minorEastAsia"/>
+              <w:noProof/>
+            </w:rPr>
+          </w:pPr>
+          <w:hyperlink w:anchor="_Toc338056908" w:history="1">
+            <w:r>
+              <w:rPr>
+                <w:rStyle w:val="Hyperlink"/>
+                <w:noProof/>
+              </w:rPr>
+              <w:t>UDP Translator</w:t>
+            </w:r>
+            <w:r>
+              <w:rPr>
+                <w:noProof/>
+                <w:webHidden/>
+              </w:rPr>
+              <w:tab/>
+            </w:r>
+            <w:r>
+              <w:rPr>
+                <w:noProof/>
+                <w:webHidden/>
+              </w:rPr>
+              <w:fldChar w:fldCharType="begin"/>
+            </w:r>
+            <w:r>
+              <w:rPr>
+                <w:noProof/>
+                <w:webHidden/>
+              </w:rPr>
+              <w:instrText xml:space="preserve"> PAGEREF _Toc338056908 \h </w:instrText>
+            </w:r>
+            <w:r>
+              <w:rPr>
+                <w:noProof/>
+                <w:webHidden/>
+              </w:rPr>
+            </w:r>
+            <w:r>
+              <w:rPr>
+                <w:noProof/>
+                <w:webHidden/>
+              </w:rPr>
+              <w:fldChar w:fldCharType="separate"/>
+            </w:r>
+            <w:r>
+              <w:rPr>
+                <w:noProof/>
+                <w:webHidden/>
+              </w:rPr>
+              <w:t>4</w:t>
+            </w:r>
+            <w:r>
+              <w:rPr>
+                <w:noProof/>
+                <w:webHidden/>
+              </w:rPr>
+              <w:fldChar w:fldCharType="end"/>
+            </w:r>
+          </w:hyperlink>
+        </w:p>
+        <w:p>
+          <w:pPr>
+            <w:pStyle w:val="TOC3"/>
+            <w:tabs>
+              <w:tab w:val="right" w:leader="dot" w:pos="9350"/>
+            </w:tabs>
+            <w:rPr>
+              <w:rFonts w:eastAsiaTheme="minorEastAsia"/>
+              <w:noProof/>
+            </w:rPr>
+          </w:pPr>
+          <w:hyperlink w:anchor="_Toc338056909" w:history="1">
+            <w:r>
+              <w:rPr>
+                <w:rStyle w:val="Hyperlink"/>
+                <w:noProof/>
+              </w:rPr>
+              <w:t>UDP Sender</w:t>
+            </w:r>
+            <w:r>
+              <w:rPr>
+                <w:noProof/>
+                <w:webHidden/>
+              </w:rPr>
+              <w:tab/>
+            </w:r>
+            <w:r>
+              <w:rPr>
+                <w:noProof/>
+                <w:webHidden/>
+              </w:rPr>
+              <w:fldChar w:fldCharType="begin"/>
+            </w:r>
+            <w:r>
+              <w:rPr>
+                <w:noProof/>
+                <w:webHidden/>
+              </w:rPr>
+              <w:instrText xml:space="preserve"> PAGEREF _Toc338056909 \h </w:instrText>
+            </w:r>
+            <w:r>
+              <w:rPr>
+                <w:noProof/>
+                <w:webHidden/>
+              </w:rPr>
+            </w:r>
+            <w:r>
+              <w:rPr>
+                <w:noProof/>
+                <w:webHidden/>
+              </w:rPr>
+              <w:fldChar w:fldCharType="separate"/>
+            </w:r>
+            <w:r>
+              <w:rPr>
+                <w:noProof/>
+                <w:webHidden/>
+              </w:rPr>
+              <w:t>5</w:t>
+            </w:r>
+            <w:r>
+              <w:rPr>
+                <w:noProof/>
+                <w:webHidden/>
+              </w:rPr>
+              <w:fldChar w:fldCharType="end"/>
+            </w:r>
+          </w:hyperlink>
+        </w:p>
+        <w:p>
+          <w:pPr>
+            <w:pStyle w:val="TOC2"/>
+            <w:tabs>
+              <w:tab w:val="right" w:leader="dot" w:pos="9350"/>
+            </w:tabs>
+            <w:rPr>
+              <w:rFonts w:eastAsiaTheme="minorEastAsia"/>
+              <w:noProof/>
+            </w:rPr>
+          </w:pPr>
+          <w:hyperlink w:anchor="_Toc338056910" w:history="1">
+            <w:r>
+              <w:rPr>
+                <w:rStyle w:val="Hyperlink"/>
+                <w:noProof/>
+              </w:rPr>
+              <w:t>Game Server</w:t>
+            </w:r>
+            <w:r>
+              <w:rPr>
+                <w:noProof/>
+                <w:webHidden/>
+              </w:rPr>
+              <w:tab/>
+            </w:r>
+            <w:r>
+              <w:rPr>
+                <w:noProof/>
+                <w:webHidden/>
+              </w:rPr>
+              <w:fldChar w:fldCharType="begin"/>
+            </w:r>
+            <w:r>
+              <w:rPr>
+                <w:noProof/>
+                <w:webHidden/>
+              </w:rPr>
+              <w:instrText xml:space="preserve"> PAGEREF _Toc338056910 \h </w:instrText>
+            </w:r>
+            <w:r>
+              <w:rPr>
+                <w:noProof/>
+                <w:webHidden/>
+              </w:rPr>
+            </w:r>
+            <w:r>
+              <w:rPr>
+                <w:noProof/>
+                <w:webHidden/>
+              </w:rPr>
+              <w:fldChar w:fldCharType="separate"/>
+            </w:r>
+            <w:r>
+              <w:rPr>
+                <w:noProof/>
+                <w:webHidden/>
+              </w:rPr>
+              <w:t>5</w:t>
+            </w:r>
+            <w:r>
+              <w:rPr>
+                <w:noProof/>
+                <w:webHidden/>
+              </w:rPr>
+              <w:fldChar w:fldCharType="end"/>
+            </w:r>
+          </w:hyperlink>
+        </w:p>
+        <w:p>
+          <w:pPr>
+            <w:pStyle w:val="TOC3"/>
+            <w:tabs>
+              <w:tab w:val="right" w:leader="dot" w:pos="9350"/>
+            </w:tabs>
+            <w:rPr>
+              <w:rFonts w:eastAsiaTheme="minorEastAsia"/>
+              <w:noProof/>
+            </w:rPr>
+          </w:pPr>
+          <w:hyperlink w:anchor="_Toc338056911" w:history="1">
+            <w:r>
+              <w:rPr>
+                <w:rStyle w:val="Hyperlink"/>
+                <w:noProof/>
+              </w:rPr>
+              <w:t>UDP Sender</w:t>
+            </w:r>
+            <w:r>
+              <w:rPr>
+                <w:noProof/>
+                <w:webHidden/>
+              </w:rPr>
+              <w:tab/>
+            </w:r>
+            <w:r>
+              <w:rPr>
+                <w:noProof/>
+                <w:webHidden/>
+              </w:rPr>
+              <w:fldChar w:fldCharType="begin"/>
+            </w:r>
+            <w:r>
+              <w:rPr>
+                <w:noProof/>
+                <w:webHidden/>
+              </w:rPr>
+              <w:instrText xml:space="preserve"> PAGEREF _Toc338056911 \h </w:instrText>
+            </w:r>
+            <w:r>
+              <w:rPr>
+                <w:noProof/>
+                <w:webHidden/>
+              </w:rPr>
+            </w:r>
+            <w:r>
+              <w:rPr>
+                <w:noProof/>
+                <w:webHidden/>
+              </w:rPr>
+              <w:fldChar w:fldCharType="separate"/>
+            </w:r>
+            <w:r>
+              <w:rPr>
+                <w:noProof/>
+                <w:webHidden/>
+              </w:rPr>
+              <w:t>5</w:t>
+            </w:r>
+            <w:r>
+              <w:rPr>
+                <w:noProof/>
+                <w:webHidden/>
+              </w:rPr>
+              <w:fldChar w:fldCharType="end"/>
+            </w:r>
+          </w:hyperlink>
+        </w:p>
+        <w:p>
+          <w:pPr>
+            <w:pStyle w:val="TOC3"/>
+            <w:tabs>
+              <w:tab w:val="right" w:leader="dot" w:pos="9350"/>
+            </w:tabs>
+            <w:rPr>
+              <w:rFonts w:eastAsiaTheme="minorEastAsia"/>
+              <w:noProof/>
+            </w:rPr>
+          </w:pPr>
+          <w:hyperlink w:anchor="_Toc338056912" w:history="1">
+            <w:r>
+              <w:rPr>
+                <w:rStyle w:val="Hyperlink"/>
+                <w:noProof/>
+              </w:rPr>
+              <w:t>UDP Receiver</w:t>
+            </w:r>
+            <w:r>
+              <w:rPr>
+                <w:noProof/>
+                <w:webHidden/>
+              </w:rPr>
+              <w:tab/>
+            </w:r>
+            <w:r>
+              <w:rPr>
+                <w:noProof/>
+                <w:webHidden/>
+              </w:rPr>
+              <w:fldChar w:fldCharType="begin"/>
+            </w:r>
+            <w:r>
+              <w:rPr>
+                <w:noProof/>
+                <w:webHidden/>
+              </w:rPr>
+              <w:instrText xml:space="preserve"> PAGEREF _Toc338056912 \h </w:instrText>
+            </w:r>
+            <w:r>
+              <w:rPr>
+                <w:noProof/>
+                <w:webHidden/>
+              </w:rPr>
+            </w:r>
+            <w:r>
+              <w:rPr>
+                <w:noProof/>
+                <w:webHidden/>
+              </w:rPr>
+              <w:fldChar w:fldCharType="separate"/>
+            </w:r>
+            <w:r>
+              <w:rPr>
+                <w:noProof/>
+                <w:webHidden/>
+              </w:rPr>
+              <w:t>5</w:t>
+            </w:r>
+            <w:r>
+              <w:rPr>
+                <w:noProof/>
+                <w:webHidden/>
+              </w:rPr>
+              <w:fldChar w:fldCharType="end"/>
+            </w:r>
+          </w:hyperlink>
+        </w:p>
+        <w:p>
+          <w:pPr>
+            <w:pStyle w:val="TOC3"/>
+            <w:tabs>
+              <w:tab w:val="right" w:leader="dot" w:pos="9350"/>
+            </w:tabs>
+            <w:rPr>
+              <w:rFonts w:eastAsiaTheme="minorEastAsia"/>
+              <w:noProof/>
+            </w:rPr>
+          </w:pPr>
+          <w:hyperlink w:anchor="_Toc338056913" w:history="1">
+            <w:r>
+              <w:rPr>
+                <w:rStyle w:val="Hyperlink"/>
+                <w:noProof/>
+              </w:rPr>
+              <w:t>Game Database</w:t>
+            </w:r>
+            <w:r>
+              <w:rPr>
+                <w:noProof/>
+                <w:webHidden/>
+              </w:rPr>
+              <w:tab/>
+            </w:r>
+            <w:r>
+              <w:rPr>
+                <w:noProof/>
+                <w:webHidden/>
+              </w:rPr>
+              <w:fldChar w:fldCharType="begin"/>
+            </w:r>
+            <w:r>
+              <w:rPr>
+                <w:noProof/>
+                <w:webHidden/>
+              </w:rPr>
+              <w:instrText xml:space="preserve"> PAGEREF _Toc338056913 \h </w:instrText>
+            </w:r>
+            <w:r>
+              <w:rPr>
+                <w:noProof/>
+                <w:webHidden/>
+              </w:rPr>
+            </w:r>
+            <w:r>
+              <w:rPr>
+                <w:noProof/>
+                <w:webHidden/>
+              </w:rPr>
+              <w:fldChar w:fldCharType="separate"/>
+            </w:r>
+            <w:r>
+              <w:rPr>
+                <w:noProof/>
+                <w:webHidden/>
+              </w:rPr>
+              <w:t>5</w:t>
             </w:r>
             <w:r>
               <w:rPr>
@@ -1301,16 +2091,17 @@
               <w:tab w:val="right" w:leader="dot" w:pos="9350"/>
             </w:tabs>
             <w:rPr>
+              <w:rFonts w:eastAsiaTheme="minorEastAsia"/>
               <w:noProof/>
             </w:rPr>
           </w:pPr>
-          <w:hyperlink w:anchor="_Toc337723032" w:history="1">
+          <w:hyperlink w:anchor="_Toc338056914" w:history="1">
             <w:r>
               <w:rPr>
                 <w:rStyle w:val="Hyperlink"/>
                 <w:noProof/>
               </w:rPr>
-              <w:t>APMAX to STB</w:t>
+              <w:t>System Data Flow</w:t>
             </w:r>
             <w:r>
               <w:rPr>
@@ -1331,7 +2122,7 @@
                 <w:noProof/>
                 <w:webHidden/>
               </w:rPr>
-              <w:instrText xml:space="preserve"> PAGEREF _Toc337723032 \h </w:instrText>
+              <w:instrText xml:space="preserve"> PAGEREF _Toc338056914 \h </w:instrText>
             </w:r>
             <w:r>
               <w:rPr>
@@ -1351,7 +2142,283 @@
                 <w:noProof/>
                 <w:webHidden/>
               </w:rPr>
-              <w:t>3</w:t>
+              <w:t>6</w:t>
+            </w:r>
+            <w:r>
+              <w:rPr>
+                <w:noProof/>
+                <w:webHidden/>
+              </w:rPr>
+              <w:fldChar w:fldCharType="end"/>
+            </w:r>
+          </w:hyperlink>
+        </w:p>
+        <w:p>
+          <w:pPr>
+            <w:pStyle w:val="TOC2"/>
+            <w:tabs>
+              <w:tab w:val="right" w:leader="dot" w:pos="9350"/>
+            </w:tabs>
+            <w:rPr>
+              <w:rFonts w:eastAsiaTheme="minorEastAsia"/>
+              <w:noProof/>
+            </w:rPr>
+          </w:pPr>
+          <w:hyperlink w:anchor="_Toc338056915" w:history="1">
+            <w:r>
+              <w:rPr>
+                <w:rStyle w:val="Hyperlink"/>
+                <w:noProof/>
+              </w:rPr>
+              <w:t>STB to vAPMAX</w:t>
+            </w:r>
+            <w:r>
+              <w:rPr>
+                <w:noProof/>
+                <w:webHidden/>
+              </w:rPr>
+              <w:tab/>
+            </w:r>
+            <w:r>
+              <w:rPr>
+                <w:noProof/>
+                <w:webHidden/>
+              </w:rPr>
+              <w:fldChar w:fldCharType="begin"/>
+            </w:r>
+            <w:r>
+              <w:rPr>
+                <w:noProof/>
+                <w:webHidden/>
+              </w:rPr>
+              <w:instrText xml:space="preserve"> PAGEREF _Toc338056915 \h </w:instrText>
+            </w:r>
+            <w:r>
+              <w:rPr>
+                <w:noProof/>
+                <w:webHidden/>
+              </w:rPr>
+            </w:r>
+            <w:r>
+              <w:rPr>
+                <w:noProof/>
+                <w:webHidden/>
+              </w:rPr>
+              <w:fldChar w:fldCharType="separate"/>
+            </w:r>
+            <w:r>
+              <w:rPr>
+                <w:noProof/>
+                <w:webHidden/>
+              </w:rPr>
+              <w:t>6</w:t>
+            </w:r>
+            <w:r>
+              <w:rPr>
+                <w:noProof/>
+                <w:webHidden/>
+              </w:rPr>
+              <w:fldChar w:fldCharType="end"/>
+            </w:r>
+          </w:hyperlink>
+        </w:p>
+        <w:p>
+          <w:pPr>
+            <w:pStyle w:val="TOC2"/>
+            <w:tabs>
+              <w:tab w:val="right" w:leader="dot" w:pos="9350"/>
+            </w:tabs>
+            <w:rPr>
+              <w:rFonts w:eastAsiaTheme="minorEastAsia"/>
+              <w:noProof/>
+            </w:rPr>
+          </w:pPr>
+          <w:hyperlink w:anchor="_Toc338056916" w:history="1">
+            <w:r>
+              <w:rPr>
+                <w:rStyle w:val="Hyperlink"/>
+                <w:noProof/>
+              </w:rPr>
+              <w:t>vAPMAX to Game Server</w:t>
+            </w:r>
+            <w:r>
+              <w:rPr>
+                <w:noProof/>
+                <w:webHidden/>
+              </w:rPr>
+              <w:tab/>
+            </w:r>
+            <w:r>
+              <w:rPr>
+                <w:noProof/>
+                <w:webHidden/>
+              </w:rPr>
+              <w:fldChar w:fldCharType="begin"/>
+            </w:r>
+            <w:r>
+              <w:rPr>
+                <w:noProof/>
+                <w:webHidden/>
+              </w:rPr>
+              <w:instrText xml:space="preserve"> PAGEREF _Toc338056916 \h </w:instrText>
+            </w:r>
+            <w:r>
+              <w:rPr>
+                <w:noProof/>
+                <w:webHidden/>
+              </w:rPr>
+            </w:r>
+            <w:r>
+              <w:rPr>
+                <w:noProof/>
+                <w:webHidden/>
+              </w:rPr>
+              <w:fldChar w:fldCharType="separate"/>
+            </w:r>
+            <w:r>
+              <w:rPr>
+                <w:noProof/>
+                <w:webHidden/>
+              </w:rPr>
+              <w:t>6</w:t>
+            </w:r>
+            <w:r>
+              <w:rPr>
+                <w:noProof/>
+                <w:webHidden/>
+              </w:rPr>
+              <w:fldChar w:fldCharType="end"/>
+            </w:r>
+          </w:hyperlink>
+        </w:p>
+        <w:p>
+          <w:pPr>
+            <w:pStyle w:val="TOC2"/>
+            <w:tabs>
+              <w:tab w:val="right" w:leader="dot" w:pos="9350"/>
+            </w:tabs>
+            <w:rPr>
+              <w:rFonts w:eastAsiaTheme="minorEastAsia"/>
+              <w:noProof/>
+            </w:rPr>
+          </w:pPr>
+          <w:hyperlink w:anchor="_Toc338056917" w:history="1">
+            <w:r>
+              <w:rPr>
+                <w:rStyle w:val="Hyperlink"/>
+                <w:noProof/>
+              </w:rPr>
+              <w:t>Game Server to vAPMAX</w:t>
+            </w:r>
+            <w:r>
+              <w:rPr>
+                <w:noProof/>
+                <w:webHidden/>
+              </w:rPr>
+              <w:tab/>
+            </w:r>
+            <w:r>
+              <w:rPr>
+                <w:noProof/>
+                <w:webHidden/>
+              </w:rPr>
+              <w:fldChar w:fldCharType="begin"/>
+            </w:r>
+            <w:r>
+              <w:rPr>
+                <w:noProof/>
+                <w:webHidden/>
+              </w:rPr>
+              <w:instrText xml:space="preserve"> PAGEREF _Toc338056917 \h </w:instrText>
+            </w:r>
+            <w:r>
+              <w:rPr>
+                <w:noProof/>
+                <w:webHidden/>
+              </w:rPr>
+            </w:r>
+            <w:r>
+              <w:rPr>
+                <w:noProof/>
+                <w:webHidden/>
+              </w:rPr>
+              <w:fldChar w:fldCharType="separate"/>
+            </w:r>
+            <w:r>
+              <w:rPr>
+                <w:noProof/>
+                <w:webHidden/>
+              </w:rPr>
+              <w:t>6</w:t>
+            </w:r>
+            <w:r>
+              <w:rPr>
+                <w:noProof/>
+                <w:webHidden/>
+              </w:rPr>
+              <w:fldChar w:fldCharType="end"/>
+            </w:r>
+          </w:hyperlink>
+        </w:p>
+        <w:p>
+          <w:pPr>
+            <w:pStyle w:val="TOC2"/>
+            <w:tabs>
+              <w:tab w:val="right" w:leader="dot" w:pos="9350"/>
+            </w:tabs>
+            <w:rPr>
+              <w:rFonts w:eastAsiaTheme="minorEastAsia"/>
+              <w:noProof/>
+            </w:rPr>
+          </w:pPr>
+          <w:hyperlink w:anchor="_Toc338056918" w:history="1">
+            <w:r>
+              <w:rPr>
+                <w:rStyle w:val="Hyperlink"/>
+                <w:noProof/>
+              </w:rPr>
+              <w:t>vAPMAX to STB</w:t>
+            </w:r>
+            <w:r>
+              <w:rPr>
+                <w:noProof/>
+                <w:webHidden/>
+              </w:rPr>
+              <w:tab/>
+            </w:r>
+            <w:r>
+              <w:rPr>
+                <w:noProof/>
+                <w:webHidden/>
+              </w:rPr>
+              <w:fldChar w:fldCharType="begin"/>
+            </w:r>
+            <w:r>
+              <w:rPr>
+                <w:noProof/>
+                <w:webHidden/>
+              </w:rPr>
+              <w:instrText xml:space="preserve"> PAGEREF _Toc338056918 \h </w:instrText>
+            </w:r>
+            <w:r>
+              <w:rPr>
+                <w:noProof/>
+                <w:webHidden/>
+              </w:rPr>
+            </w:r>
+            <w:r>
+              <w:rPr>
+                <w:noProof/>
+                <w:webHidden/>
+              </w:rPr>
+              <w:fldChar w:fldCharType="separate"/>
+            </w:r>
+            <w:r>
+              <w:rPr>
+                <w:noProof/>
+                <w:webHidden/>
+              </w:rPr>
+              <w:t>6</w:t>
             </w:r>
             <w:r>
               <w:rPr>
@@ -1376,81 +2443,1072 @@
     </w:sdt>
     <w:p/>
     <w:p/>
+    <w:p>
+      <w:pPr>
+        <w:pStyle w:val="Heading1"/>
+        <w:rPr>
+          <w:sz w:val="48"/>
+          <w:szCs w:val="48"/>
+        </w:rPr>
+      </w:pPr>
+      <w:bookmarkStart w:id="2" w:name="_Toc338056900"/>
+      <w:r>
+        <w:rPr>
+          <w:sz w:val="48"/>
+          <w:szCs w:val="48"/>
+        </w:rPr>
+        <w:lastRenderedPageBreak/>
+        <w:t>Introduction</w:t>
+      </w:r>
+      <w:bookmarkEnd w:id="2"/>
+    </w:p>
+    <w:p>
+      <w:r>
+        <w:t>This document describes the communication protocol design for the STBMF. Our focus is on the three major components involved in our system. First</w:t>
+      </w:r>
+      <w:r>
+        <w:t xml:space="preserve"> is our</w:t>
+      </w:r>
+      <w:r>
+        <w:t xml:space="preserve"> Game Server, which is in charge of managing the data, resources, and services of the STBMF system. Next</w:t>
+      </w:r>
+      <w:r>
+        <w:t>,</w:t>
+      </w:r>
+      <w:r>
+        <w:t xml:space="preserve"> the Virtual APMAX, which will act as a conceptual hardware layer of the existing APMAX to minimize design issues with current protocols existing in a live network environment.</w:t>
+      </w:r>
+      <w:r>
+        <w:t xml:space="preserve"> The STB will be the final component that will act as a portal between the user and the Game Server. Together these components will create the foundation for the STBMF, offering high availability, scalability, and robustness to users.</w:t>
+      </w:r>
+    </w:p>
+    <w:p>
+      <w:pPr>
+        <w:pStyle w:val="Heading1"/>
+        <w:rPr>
+          <w:sz w:val="48"/>
+          <w:szCs w:val="48"/>
+        </w:rPr>
+      </w:pPr>
+      <w:bookmarkStart w:id="3" w:name="_Toc338056901"/>
+      <w:r>
+        <w:rPr>
+          <w:sz w:val="48"/>
+          <w:szCs w:val="48"/>
+        </w:rPr>
+        <w:t>System Communication Architecture</w:t>
+      </w:r>
+      <w:bookmarkEnd w:id="3"/>
+    </w:p>
+    <w:p>
+      <w:r>
+        <w:object w:dxaOrig="6875" w:dyaOrig="9816">
+          <v:shapetype id="_x0000_t75" coordsize="21600,21600" o:spt="75" o:preferrelative="t" path="m@4@5l@4@11@9@11@9@5xe" filled="f" stroked="f">
+            <v:stroke joinstyle="miter"/>
+            <v:formulas>
+              <v:f eqn="if lineDrawn pixelLineWidth 0"/>
+              <v:f eqn="sum @0 1 0"/>
+              <v:f eqn="sum 0 0 @1"/>
+              <v:f eqn="prod @2 1 2"/>
+              <v:f eqn="prod @3 21600 pixelWidth"/>
+              <v:f eqn="prod @3 21600 pixelHeight"/>
+              <v:f eqn="sum @0 0 1"/>
+              <v:f eqn="prod @6 1 2"/>
+              <v:f eqn="prod @7 21600 pixelWidth"/>
+              <v:f eqn="sum @8 21600 0"/>
+              <v:f eqn="prod @7 21600 pixelHeight"/>
+              <v:f eqn="sum @10 21600 0"/>
+            </v:formulas>
+            <v:path o:extrusionok="f" gradientshapeok="t" o:connecttype="rect"/>
+            <o:lock v:ext="edit" aspectratio="t"/>
+          </v:shapetype>
+          <v:shape id="_x0000_i1025" type="#_x0000_t75" style="width:343.7pt;height:398.8pt" o:ole="">
+            <v:imagedata r:id="rId8" o:title=""/>
+          </v:shape>
+          <o:OLEObject Type="Embed" ProgID="Visio.Drawing.11" ShapeID="_x0000_i1025" DrawAspect="Content" ObjectID="_1411798736" r:id="rId9"/>
+        </w:object>
+      </w:r>
+    </w:p>
     <w:p/>
+    <w:p>
+      <w:pPr>
+        <w:pStyle w:val="Heading1"/>
+        <w:rPr>
+          <w:sz w:val="48"/>
+          <w:szCs w:val="48"/>
+        </w:rPr>
+      </w:pPr>
+      <w:bookmarkStart w:id="4" w:name="_Toc338056902"/>
+      <w:r>
+        <w:rPr>
+          <w:sz w:val="48"/>
+          <w:szCs w:val="48"/>
+        </w:rPr>
+        <w:lastRenderedPageBreak/>
+        <w:t>Communication Layers</w:t>
+      </w:r>
+      <w:bookmarkEnd w:id="4"/>
+    </w:p>
+    <w:p>
+      <w:r>
+        <w:t xml:space="preserve">Our communication layers will consist of the STB, </w:t>
+      </w:r>
+      <w:proofErr w:type="spellStart"/>
+      <w:r>
+        <w:t>vAPMAX</w:t>
+      </w:r>
+      <w:proofErr w:type="spellEnd"/>
+      <w:r>
+        <w:t xml:space="preserve">, and Game Server. The STB will be designed using C++/QT to process incoming and outgoing UDP packets following the newly designed command link definitions. Our </w:t>
+      </w:r>
+      <w:proofErr w:type="spellStart"/>
+      <w:r>
+        <w:t>vAPMAX</w:t>
+      </w:r>
+      <w:proofErr w:type="spellEnd"/>
+      <w:r>
+        <w:t xml:space="preserve"> will be designed using C# and will exist on the server machine of our locally simulated STBMF system. It will act as the pass through mechanism that processes packets accordingly and sets them up for their destination to the STB or Game Server. Finally the Game Server will be designed using C# and MySQL to query the data from the game database.</w:t>
+      </w:r>
+    </w:p>
+    <w:p>
+      <w:pPr>
+        <w:pStyle w:val="Heading2"/>
+        <w:rPr>
+          <w:sz w:val="36"/>
+          <w:szCs w:val="36"/>
+        </w:rPr>
+      </w:pPr>
+      <w:bookmarkStart w:id="5" w:name="_Toc338056903"/>
+      <w:r>
+        <w:rPr>
+          <w:sz w:val="36"/>
+          <w:szCs w:val="36"/>
+        </w:rPr>
+        <w:t>STB</w:t>
+      </w:r>
+      <w:bookmarkStart w:id="6" w:name="_GoBack"/>
+      <w:bookmarkEnd w:id="5"/>
+      <w:bookmarkEnd w:id="6"/>
+    </w:p>
+    <w:p>
+      <w:pPr>
+        <w:pStyle w:val="ListParagraph"/>
+        <w:numPr>
+          <w:ilvl w:val="0"/>
+          <w:numId w:val="1"/>
+        </w:numPr>
+      </w:pPr>
+      <w:proofErr w:type="spellStart"/>
+      <w:r>
+        <w:t>QtNetwork</w:t>
+      </w:r>
+      <w:proofErr w:type="spellEnd"/>
+      <w:r>
+        <w:t xml:space="preserve">- used for UDP </w:t>
+      </w:r>
+      <w:proofErr w:type="spellStart"/>
+      <w:r>
+        <w:t>communicationprotocol</w:t>
+      </w:r>
+      <w:proofErr w:type="spellEnd"/>
+      <w:r>
+        <w:t xml:space="preserve"> to </w:t>
+      </w:r>
+      <w:proofErr w:type="spellStart"/>
+      <w:r>
+        <w:t>vAPMAX</w:t>
+      </w:r>
+      <w:proofErr w:type="spellEnd"/>
+    </w:p>
+    <w:p>
+      <w:pPr>
+        <w:pStyle w:val="ListParagraph"/>
+        <w:numPr>
+          <w:ilvl w:val="0"/>
+          <w:numId w:val="1"/>
+        </w:numPr>
+      </w:pPr>
+      <w:proofErr w:type="spellStart"/>
+      <w:r>
+        <w:t>QtUiLoader</w:t>
+      </w:r>
+      <w:proofErr w:type="spellEnd"/>
+      <w:r>
+        <w:t xml:space="preserve"> (</w:t>
+      </w:r>
+      <w:proofErr w:type="spellStart"/>
+      <w:r>
+        <w:t>QLibrary</w:t>
+      </w:r>
+      <w:proofErr w:type="spellEnd"/>
+      <w:r>
+        <w:t>) – used for general display mechanism for model/view architecture</w:t>
+      </w:r>
+    </w:p>
+    <w:p>
+      <w:pPr>
+        <w:pStyle w:val="Heading3"/>
+      </w:pPr>
+      <w:bookmarkStart w:id="7" w:name="_Toc338056904"/>
+      <w:r>
+        <w:t xml:space="preserve">UDP </w:t>
+      </w:r>
+      <w:r>
+        <w:t>Receiver</w:t>
+      </w:r>
+      <w:bookmarkEnd w:id="7"/>
+    </w:p>
+    <w:p>
+      <w:pPr>
+        <w:pStyle w:val="ListParagraph"/>
+        <w:numPr>
+          <w:ilvl w:val="0"/>
+          <w:numId w:val="3"/>
+        </w:numPr>
+      </w:pPr>
+      <w:r>
+        <w:t xml:space="preserve">Initialize </w:t>
+      </w:r>
+      <w:proofErr w:type="spellStart"/>
+      <w:r>
+        <w:t>UDPsocket</w:t>
+      </w:r>
+      <w:proofErr w:type="spellEnd"/>
+      <w:r>
+        <w:t xml:space="preserve"> to port and </w:t>
+      </w:r>
+      <w:r>
+        <w:t xml:space="preserve">host </w:t>
+      </w:r>
+      <w:r>
+        <w:t>address</w:t>
+      </w:r>
+    </w:p>
+    <w:p>
+      <w:pPr>
+        <w:pStyle w:val="ListParagraph"/>
+        <w:numPr>
+          <w:ilvl w:val="0"/>
+          <w:numId w:val="3"/>
+        </w:numPr>
+      </w:pPr>
+      <w:r>
+        <w:t xml:space="preserve">Connect </w:t>
+      </w:r>
+      <w:proofErr w:type="spellStart"/>
+      <w:r>
+        <w:t>UDPsocket</w:t>
+      </w:r>
+      <w:proofErr w:type="spellEnd"/>
+      <w:r>
+        <w:t xml:space="preserve"> to ready read signal</w:t>
+      </w:r>
+    </w:p>
+    <w:p>
+      <w:pPr>
+        <w:pStyle w:val="ListParagraph"/>
+        <w:numPr>
+          <w:ilvl w:val="0"/>
+          <w:numId w:val="3"/>
+        </w:numPr>
+      </w:pPr>
+      <w:r>
+        <w:t xml:space="preserve">Connect read </w:t>
+      </w:r>
+      <w:proofErr w:type="spellStart"/>
+      <w:r>
+        <w:t>read</w:t>
+      </w:r>
+      <w:proofErr w:type="spellEnd"/>
+      <w:r>
+        <w:t xml:space="preserve"> signal to </w:t>
+      </w:r>
+      <w:proofErr w:type="spellStart"/>
+      <w:r>
+        <w:t>processUDP</w:t>
+      </w:r>
+      <w:proofErr w:type="spellEnd"/>
+      <w:r>
+        <w:t xml:space="preserve"> slot</w:t>
+      </w:r>
+    </w:p>
+    <w:p>
+      <w:pPr>
+        <w:pStyle w:val="ListParagraph"/>
+        <w:numPr>
+          <w:ilvl w:val="0"/>
+          <w:numId w:val="3"/>
+        </w:numPr>
+      </w:pPr>
+      <w:proofErr w:type="spellStart"/>
+      <w:r>
+        <w:t>ProccessUDP</w:t>
+      </w:r>
+      <w:proofErr w:type="spellEnd"/>
+      <w:r>
+        <w:t xml:space="preserve"> listens to socket and processes incoming packet</w:t>
+      </w:r>
+    </w:p>
+    <w:p>
+      <w:pPr>
+        <w:pStyle w:val="Heading3"/>
+      </w:pPr>
+      <w:bookmarkStart w:id="8" w:name="_Toc338056905"/>
+      <w:r>
+        <w:t>UDP Sender</w:t>
+      </w:r>
+      <w:bookmarkEnd w:id="8"/>
+    </w:p>
+    <w:p>
+      <w:pPr>
+        <w:pStyle w:val="ListParagraph"/>
+        <w:numPr>
+          <w:ilvl w:val="0"/>
+          <w:numId w:val="8"/>
+        </w:numPr>
+      </w:pPr>
+      <w:r>
+        <w:t>Initialize UDP Socket to port and host address</w:t>
+      </w:r>
+    </w:p>
+    <w:p>
+      <w:pPr>
+        <w:pStyle w:val="ListParagraph"/>
+        <w:numPr>
+          <w:ilvl w:val="0"/>
+          <w:numId w:val="8"/>
+        </w:numPr>
+      </w:pPr>
+      <w:r>
+        <w:t>Setup timer for packet transmission</w:t>
+      </w:r>
+    </w:p>
+    <w:p>
+      <w:pPr>
+        <w:pStyle w:val="ListParagraph"/>
+        <w:numPr>
+          <w:ilvl w:val="0"/>
+          <w:numId w:val="8"/>
+        </w:numPr>
+      </w:pPr>
+      <w:r>
+        <w:t>Set message number to 1 (used to track packets sent)</w:t>
+      </w:r>
+    </w:p>
+    <w:p>
+      <w:pPr>
+        <w:pStyle w:val="ListParagraph"/>
+        <w:numPr>
+          <w:ilvl w:val="0"/>
+          <w:numId w:val="8"/>
+        </w:numPr>
+      </w:pPr>
+      <w:r>
+        <w:t xml:space="preserve">Start timer if we want to send </w:t>
+      </w:r>
+      <w:proofErr w:type="spellStart"/>
+      <w:r>
+        <w:t>UDPpacket</w:t>
+      </w:r>
+      <w:proofErr w:type="spellEnd"/>
+    </w:p>
+    <w:p>
+      <w:pPr>
+        <w:pStyle w:val="ListParagraph"/>
+        <w:numPr>
+          <w:ilvl w:val="0"/>
+          <w:numId w:val="8"/>
+        </w:numPr>
+      </w:pPr>
+      <w:r>
+        <w:t xml:space="preserve">Timer ends, signal is emitted, </w:t>
+      </w:r>
+      <w:r>
+        <w:t>Set up UDP packet</w:t>
+      </w:r>
+      <w:r>
+        <w:t xml:space="preserve"> slot receives signal</w:t>
+      </w:r>
+    </w:p>
+    <w:p>
+      <w:pPr>
+        <w:pStyle w:val="ListParagraph"/>
+        <w:numPr>
+          <w:ilvl w:val="0"/>
+          <w:numId w:val="8"/>
+        </w:numPr>
+      </w:pPr>
+      <w:r>
+        <w:t xml:space="preserve">Set up UDP packet slot </w:t>
+      </w:r>
+      <w:r>
+        <w:t xml:space="preserve"> builds UDP packet </w:t>
+      </w:r>
+      <w:r>
+        <w:t>with corresponding</w:t>
+      </w:r>
+      <w:r>
+        <w:t xml:space="preserve"> message number</w:t>
+      </w:r>
+    </w:p>
+    <w:p>
+      <w:pPr>
+        <w:pStyle w:val="ListParagraph"/>
+        <w:numPr>
+          <w:ilvl w:val="0"/>
+          <w:numId w:val="8"/>
+        </w:numPr>
+      </w:pPr>
+      <w:r>
+        <w:t>Increment message number for next message to be sent</w:t>
+      </w:r>
+    </w:p>
+    <w:p>
+      <w:pPr>
+        <w:pStyle w:val="ListParagraph"/>
+      </w:pPr>
+    </w:p>
+    <w:p>
+      <w:pPr>
+        <w:pStyle w:val="Heading2"/>
+        <w:rPr>
+          <w:sz w:val="36"/>
+          <w:szCs w:val="36"/>
+        </w:rPr>
+      </w:pPr>
+      <w:bookmarkStart w:id="9" w:name="_Toc338056906"/>
+      <w:proofErr w:type="spellStart"/>
+      <w:proofErr w:type="gramStart"/>
+      <w:r>
+        <w:rPr>
+          <w:sz w:val="36"/>
+          <w:szCs w:val="36"/>
+        </w:rPr>
+        <w:t>vAPMAX</w:t>
+      </w:r>
+      <w:bookmarkEnd w:id="9"/>
+      <w:proofErr w:type="spellEnd"/>
+      <w:proofErr w:type="gramEnd"/>
+    </w:p>
+    <w:p>
+      <w:pPr>
+        <w:pStyle w:val="ListParagraph"/>
+        <w:numPr>
+          <w:ilvl w:val="0"/>
+          <w:numId w:val="4"/>
+        </w:numPr>
+      </w:pPr>
+      <w:r>
+        <w:t xml:space="preserve">Some </w:t>
+      </w:r>
+      <w:proofErr w:type="spellStart"/>
+      <w:r>
+        <w:t>udp</w:t>
+      </w:r>
+      <w:proofErr w:type="spellEnd"/>
+      <w:r>
+        <w:t xml:space="preserve"> c# </w:t>
+      </w:r>
+      <w:proofErr w:type="spellStart"/>
+      <w:r>
+        <w:t>dll</w:t>
+      </w:r>
+      <w:proofErr w:type="spellEnd"/>
+      <w:r>
+        <w:t xml:space="preserve"> or whatever</w:t>
+      </w:r>
+    </w:p>
+    <w:p>
+      <w:pPr>
+        <w:pStyle w:val="Heading3"/>
+      </w:pPr>
+      <w:bookmarkStart w:id="10" w:name="_Toc338056907"/>
+      <w:r>
+        <w:t>UDP Receiver</w:t>
+      </w:r>
+      <w:bookmarkEnd w:id="10"/>
+    </w:p>
+    <w:p>
+      <w:pPr>
+        <w:pStyle w:val="ListParagraph"/>
+        <w:numPr>
+          <w:ilvl w:val="0"/>
+          <w:numId w:val="4"/>
+        </w:numPr>
+      </w:pPr>
+      <w:r>
+        <w:t>Receive UDP packet from Game Server</w:t>
+      </w:r>
+    </w:p>
+    <w:p>
+      <w:pPr>
+        <w:pStyle w:val="ListParagraph"/>
+        <w:numPr>
+          <w:ilvl w:val="1"/>
+          <w:numId w:val="4"/>
+        </w:numPr>
+      </w:pPr>
+      <w:r>
+        <w:t>Pass packet to translator</w:t>
+      </w:r>
+    </w:p>
+    <w:p>
+      <w:pPr>
+        <w:pStyle w:val="ListParagraph"/>
+        <w:numPr>
+          <w:ilvl w:val="0"/>
+          <w:numId w:val="4"/>
+        </w:numPr>
+      </w:pPr>
+      <w:r>
+        <w:t>Receive UDP packet from STB</w:t>
+      </w:r>
+    </w:p>
+    <w:p>
+      <w:pPr>
+        <w:pStyle w:val="ListParagraph"/>
+        <w:numPr>
+          <w:ilvl w:val="1"/>
+          <w:numId w:val="4"/>
+        </w:numPr>
+      </w:pPr>
+      <w:r>
+        <w:t>Pass pack to translator</w:t>
+      </w:r>
+    </w:p>
+    <w:p>
+      <w:pPr>
+        <w:pStyle w:val="Heading3"/>
+      </w:pPr>
+      <w:bookmarkStart w:id="11" w:name="_Toc338056908"/>
+      <w:r>
+        <w:t>UDP Translator</w:t>
+      </w:r>
+      <w:bookmarkEnd w:id="11"/>
+    </w:p>
+    <w:p>
+      <w:pPr>
+        <w:pStyle w:val="ListParagraph"/>
+        <w:numPr>
+          <w:ilvl w:val="0"/>
+          <w:numId w:val="6"/>
+        </w:numPr>
+      </w:pPr>
+      <w:r>
+        <w:t>Parse header for destination</w:t>
+      </w:r>
+    </w:p>
+    <w:p>
+      <w:pPr>
+        <w:pStyle w:val="ListParagraph"/>
+        <w:numPr>
+          <w:ilvl w:val="0"/>
+          <w:numId w:val="6"/>
+        </w:numPr>
+      </w:pPr>
+      <w:r>
+        <w:t>Unwrap CL2 if necessary</w:t>
+      </w:r>
+    </w:p>
+    <w:p>
+      <w:pPr>
+        <w:pStyle w:val="ListParagraph"/>
+        <w:numPr>
+          <w:ilvl w:val="0"/>
+          <w:numId w:val="6"/>
+        </w:numPr>
+      </w:pPr>
+      <w:r>
+        <w:t>Pass to UDP Sender</w:t>
+      </w:r>
+    </w:p>
+    <w:p>
+      <w:pPr>
+        <w:pStyle w:val="Heading3"/>
+      </w:pPr>
+      <w:bookmarkStart w:id="12" w:name="_Toc338056909"/>
+      <w:r>
+        <w:lastRenderedPageBreak/>
+        <w:t>UDP Sender</w:t>
+      </w:r>
+      <w:bookmarkEnd w:id="12"/>
+    </w:p>
+    <w:p>
+      <w:pPr>
+        <w:pStyle w:val="ListParagraph"/>
+        <w:numPr>
+          <w:ilvl w:val="0"/>
+          <w:numId w:val="7"/>
+        </w:numPr>
+      </w:pPr>
+      <w:r>
+        <w:t>Create UDP packet if necessary</w:t>
+      </w:r>
+    </w:p>
+    <w:p>
+      <w:pPr>
+        <w:pStyle w:val="ListParagraph"/>
+        <w:numPr>
+          <w:ilvl w:val="0"/>
+          <w:numId w:val="7"/>
+        </w:numPr>
+      </w:pPr>
+      <w:r>
+        <w:t>Send packet to destination</w:t>
+      </w:r>
+    </w:p>
+    <w:p>
+      <w:pPr>
+        <w:pStyle w:val="ListParagraph"/>
+        <w:numPr>
+          <w:ilvl w:val="1"/>
+          <w:numId w:val="7"/>
+        </w:numPr>
+      </w:pPr>
+      <w:r>
+        <w:t>STB</w:t>
+      </w:r>
+    </w:p>
+    <w:p>
+      <w:pPr>
+        <w:pStyle w:val="ListParagraph"/>
+        <w:numPr>
+          <w:ilvl w:val="1"/>
+          <w:numId w:val="7"/>
+        </w:numPr>
+      </w:pPr>
+      <w:r>
+        <w:t>Game Server</w:t>
+      </w:r>
+    </w:p>
     <w:p/>
+    <w:p>
+      <w:pPr>
+        <w:pStyle w:val="Heading2"/>
+        <w:rPr>
+          <w:sz w:val="36"/>
+          <w:szCs w:val="36"/>
+        </w:rPr>
+      </w:pPr>
+      <w:bookmarkStart w:id="13" w:name="_Toc338056910"/>
+      <w:r>
+        <w:rPr>
+          <w:sz w:val="36"/>
+          <w:szCs w:val="36"/>
+        </w:rPr>
+        <w:t>Game Server</w:t>
+      </w:r>
+      <w:bookmarkEnd w:id="13"/>
+    </w:p>
+    <w:p>
+      <w:pPr>
+        <w:pStyle w:val="ListParagraph"/>
+        <w:numPr>
+          <w:ilvl w:val="0"/>
+          <w:numId w:val="9"/>
+        </w:numPr>
+      </w:pPr>
+      <w:r>
+        <w:t xml:space="preserve">MySQL database </w:t>
+      </w:r>
+    </w:p>
+    <w:p>
+      <w:pPr>
+        <w:pStyle w:val="ListParagraph"/>
+        <w:numPr>
+          <w:ilvl w:val="0"/>
+          <w:numId w:val="9"/>
+        </w:numPr>
+      </w:pPr>
+      <w:r>
+        <w:t xml:space="preserve">C# </w:t>
+      </w:r>
+      <w:proofErr w:type="spellStart"/>
+      <w:r>
+        <w:t>dll</w:t>
+      </w:r>
+      <w:proofErr w:type="spellEnd"/>
+      <w:r>
+        <w:t xml:space="preserve"> to communicate with database</w:t>
+      </w:r>
+    </w:p>
+    <w:p>
+      <w:pPr>
+        <w:pStyle w:val="ListParagraph"/>
+        <w:numPr>
+          <w:ilvl w:val="0"/>
+          <w:numId w:val="9"/>
+        </w:numPr>
+      </w:pPr>
+      <w:r>
+        <w:t xml:space="preserve">C# </w:t>
+      </w:r>
+      <w:proofErr w:type="spellStart"/>
+      <w:r>
+        <w:t>dll</w:t>
+      </w:r>
+      <w:proofErr w:type="spellEnd"/>
+      <w:r>
+        <w:t xml:space="preserve"> to process </w:t>
+      </w:r>
+      <w:proofErr w:type="spellStart"/>
+      <w:r>
+        <w:t>udp</w:t>
+      </w:r>
+      <w:proofErr w:type="spellEnd"/>
+      <w:r>
+        <w:t xml:space="preserve"> packets from </w:t>
+      </w:r>
+      <w:proofErr w:type="spellStart"/>
+      <w:r>
+        <w:t>vAPMAX</w:t>
+      </w:r>
+      <w:proofErr w:type="spellEnd"/>
+    </w:p>
+    <w:p>
+      <w:pPr>
+        <w:pStyle w:val="ListParagraph"/>
+        <w:numPr>
+          <w:ilvl w:val="1"/>
+          <w:numId w:val="9"/>
+        </w:numPr>
+      </w:pPr>
+      <w:proofErr w:type="gramStart"/>
+      <w:r>
+        <w:t>Resources, data, AI, objects</w:t>
+      </w:r>
+      <w:proofErr w:type="gramEnd"/>
+      <w:r>
+        <w:t>…</w:t>
+      </w:r>
+    </w:p>
+    <w:p>
+      <w:pPr>
+        <w:pStyle w:val="Heading3"/>
+      </w:pPr>
+      <w:bookmarkStart w:id="14" w:name="_Toc338056911"/>
+      <w:r>
+        <w:t>UDP Sender</w:t>
+      </w:r>
+      <w:bookmarkEnd w:id="14"/>
+    </w:p>
+    <w:p>
+      <w:pPr>
+        <w:pStyle w:val="ListParagraph"/>
+        <w:numPr>
+          <w:ilvl w:val="0"/>
+          <w:numId w:val="10"/>
+        </w:numPr>
+      </w:pPr>
+      <w:r>
+        <w:t xml:space="preserve">Create UDP packet with requested </w:t>
+      </w:r>
+      <w:proofErr w:type="spellStart"/>
+      <w:r>
+        <w:t>object,resource,data</w:t>
+      </w:r>
+      <w:proofErr w:type="spellEnd"/>
+    </w:p>
+    <w:p>
+      <w:pPr>
+        <w:pStyle w:val="ListParagraph"/>
+        <w:numPr>
+          <w:ilvl w:val="0"/>
+          <w:numId w:val="10"/>
+        </w:numPr>
+      </w:pPr>
+      <w:r>
+        <w:t xml:space="preserve">Send packet to </w:t>
+      </w:r>
+      <w:proofErr w:type="spellStart"/>
+      <w:r>
+        <w:t>vAPMAX</w:t>
+      </w:r>
+      <w:proofErr w:type="spellEnd"/>
+    </w:p>
+    <w:p>
+      <w:pPr>
+        <w:pStyle w:val="ListParagraph"/>
+        <w:numPr>
+          <w:ilvl w:val="1"/>
+          <w:numId w:val="10"/>
+        </w:numPr>
+      </w:pPr>
+      <w:r>
+        <w:t>Log communication for errors and traceability stuff</w:t>
+      </w:r>
+    </w:p>
+    <w:p>
+      <w:pPr>
+        <w:pStyle w:val="Heading3"/>
+      </w:pPr>
+      <w:bookmarkStart w:id="15" w:name="_Toc338056912"/>
+      <w:r>
+        <w:t>UDP Receiver</w:t>
+      </w:r>
+      <w:bookmarkEnd w:id="15"/>
+    </w:p>
+    <w:p>
+      <w:pPr>
+        <w:pStyle w:val="ListParagraph"/>
+        <w:numPr>
+          <w:ilvl w:val="0"/>
+          <w:numId w:val="11"/>
+        </w:numPr>
+      </w:pPr>
+      <w:r>
+        <w:t xml:space="preserve">Receive UDP packet from </w:t>
+      </w:r>
+      <w:proofErr w:type="spellStart"/>
+      <w:r>
+        <w:t>vAPMAX</w:t>
+      </w:r>
+      <w:proofErr w:type="spellEnd"/>
+    </w:p>
+    <w:p>
+      <w:pPr>
+        <w:pStyle w:val="ListParagraph"/>
+        <w:numPr>
+          <w:ilvl w:val="0"/>
+          <w:numId w:val="11"/>
+        </w:numPr>
+      </w:pPr>
+      <w:r>
+        <w:t>Process packet</w:t>
+      </w:r>
+    </w:p>
+    <w:p>
+      <w:pPr>
+        <w:pStyle w:val="ListParagraph"/>
+        <w:numPr>
+          <w:ilvl w:val="1"/>
+          <w:numId w:val="11"/>
+        </w:numPr>
+      </w:pPr>
+      <w:r>
+        <w:t>Request for:</w:t>
+      </w:r>
+    </w:p>
+    <w:p>
+      <w:pPr>
+        <w:pStyle w:val="ListParagraph"/>
+        <w:numPr>
+          <w:ilvl w:val="2"/>
+          <w:numId w:val="11"/>
+        </w:numPr>
+      </w:pPr>
+      <w:r>
+        <w:t>Initialize new resources</w:t>
+      </w:r>
+    </w:p>
+    <w:p>
+      <w:pPr>
+        <w:pStyle w:val="ListParagraph"/>
+        <w:numPr>
+          <w:ilvl w:val="2"/>
+          <w:numId w:val="11"/>
+        </w:numPr>
+      </w:pPr>
+      <w:r>
+        <w:t>Update existing resources</w:t>
+      </w:r>
+    </w:p>
+    <w:p>
+      <w:pPr>
+        <w:pStyle w:val="ListParagraph"/>
+        <w:numPr>
+          <w:ilvl w:val="2"/>
+          <w:numId w:val="11"/>
+        </w:numPr>
+      </w:pPr>
+      <w:r>
+        <w:t>Store resources</w:t>
+      </w:r>
+    </w:p>
+    <w:p>
+      <w:pPr>
+        <w:pStyle w:val="Heading3"/>
+      </w:pPr>
+      <w:bookmarkStart w:id="16" w:name="_Toc338056913"/>
+      <w:r>
+        <w:t>Game Database</w:t>
+      </w:r>
+      <w:bookmarkEnd w:id="16"/>
+    </w:p>
+    <w:p>
+      <w:pPr>
+        <w:pStyle w:val="ListParagraph"/>
+        <w:numPr>
+          <w:ilvl w:val="0"/>
+          <w:numId w:val="12"/>
+        </w:numPr>
+      </w:pPr>
+      <w:r>
+        <w:t>Schema for STBMF</w:t>
+      </w:r>
+    </w:p>
+    <w:p>
+      <w:pPr>
+        <w:pStyle w:val="ListParagraph"/>
+        <w:numPr>
+          <w:ilvl w:val="1"/>
+          <w:numId w:val="12"/>
+        </w:numPr>
+      </w:pPr>
+      <w:r>
+        <w:t>Resources, data, AI</w:t>
+      </w:r>
+    </w:p>
+    <w:p>
+      <w:pPr>
+        <w:pStyle w:val="ListParagraph"/>
+        <w:numPr>
+          <w:ilvl w:val="1"/>
+          <w:numId w:val="12"/>
+        </w:numPr>
+      </w:pPr>
+      <w:r>
+        <w:t>STB account and corresponding information</w:t>
+      </w:r>
+    </w:p>
+    <w:p>
+      <w:pPr>
+        <w:pStyle w:val="ListParagraph"/>
+        <w:ind w:left="1440"/>
+      </w:pPr>
+    </w:p>
+    <w:p>
+      <w:pPr>
+        <w:pStyle w:val="ListParagraph"/>
+        <w:ind w:left="1440"/>
+      </w:pPr>
+      <w:r>
+        <w:t xml:space="preserve">**Note: keep in mind we want this schema for STB account table to be scalable to a unique account name (e.g. RedDriver42) not STB1 on some </w:t>
+      </w:r>
+      <w:proofErr w:type="spellStart"/>
+      <w:r>
+        <w:t>homegroup</w:t>
+      </w:r>
+      <w:proofErr w:type="spellEnd"/>
+      <w:r>
+        <w:t xml:space="preserve">. Initially we will go with the STB1, STB2, STB3 on some home group naming convention but to make our </w:t>
+      </w:r>
+      <w:proofErr w:type="spellStart"/>
+      <w:r>
+        <w:t>lifes</w:t>
+      </w:r>
+      <w:proofErr w:type="spellEnd"/>
+      <w:r>
+        <w:t xml:space="preserve"> easier we should keep the above in mind as there is no way to distinguish a user on a given STB by STB1</w:t>
+      </w:r>
+      <w:proofErr w:type="gramStart"/>
+      <w:r>
+        <w:t>,STB2,STB3</w:t>
+      </w:r>
+      <w:proofErr w:type="gramEnd"/>
+      <w:r>
+        <w:t>….., therefore no need for ranking and the other concepts described in the multiplayer proof of concept for checkers document.</w:t>
+      </w:r>
+    </w:p>
     <w:p/>
-    <w:p/>
-    <w:p/>
-    <w:p/>
-    <w:p/>
-    <w:p/>
-    <w:p/>
-    <w:p/>
-    <w:p/>
-    <w:p/>
-    <w:p/>
-    <w:p/>
-    <w:p/>
-    <w:p/>
     <w:p>
       <w:pPr>
         <w:pStyle w:val="Heading1"/>
       </w:pPr>
-      <w:bookmarkStart w:id="2" w:name="_Toc337723028"/>
-      <w:r>
-        <w:t>Introduction</w:t>
-      </w:r>
-      <w:bookmarkEnd w:id="2"/>
-    </w:p>
-    <w:p/>
+    </w:p>
     <w:p>
       <w:pPr>
         <w:pStyle w:val="Heading1"/>
-      </w:pPr>
-      <w:r>
-        <w:t>System Communication Architecture</w:t>
-      </w:r>
-    </w:p>
-    <w:p/>
-    <w:p>
-      <w:pPr>
-        <w:pStyle w:val="Heading1"/>
-      </w:pPr>
-      <w:bookmarkStart w:id="3" w:name="_Toc337723029"/>
-      <w:r>
-        <w:t>STB to APMAX</w:t>
-      </w:r>
-      <w:bookmarkEnd w:id="3"/>
-    </w:p>
-    <w:p>
-      <w:pPr>
-        <w:pStyle w:val="Heading1"/>
-      </w:pPr>
-      <w:bookmarkStart w:id="4" w:name="_Toc337723030"/>
-      <w:r>
-        <w:t>APMAX to Game Server</w:t>
-      </w:r>
-      <w:bookmarkEnd w:id="4"/>
-    </w:p>
-    <w:p>
-      <w:pPr>
-        <w:pStyle w:val="Heading1"/>
-      </w:pPr>
-      <w:bookmarkStart w:id="5" w:name="_Toc337723031"/>
-      <w:r>
-        <w:t>Game Server to APMAX</w:t>
-      </w:r>
-      <w:bookmarkEnd w:id="5"/>
-    </w:p>
-    <w:p>
-      <w:pPr>
-        <w:pStyle w:val="Heading1"/>
-      </w:pPr>
-      <w:bookmarkStart w:id="6" w:name="_Toc337723032"/>
-      <w:r>
-        <w:t>APMAX to STB</w:t>
-      </w:r>
-      <w:bookmarkEnd w:id="6"/>
+        <w:rPr>
+          <w:sz w:val="48"/>
+          <w:szCs w:val="48"/>
+        </w:rPr>
+      </w:pPr>
+      <w:bookmarkStart w:id="17" w:name="_Toc338056914"/>
+      <w:r>
+        <w:rPr>
+          <w:sz w:val="48"/>
+          <w:szCs w:val="48"/>
+        </w:rPr>
+        <w:t>System Data Flow</w:t>
+      </w:r>
+      <w:bookmarkEnd w:id="17"/>
+    </w:p>
+    <w:p>
+      <w:pPr>
+        <w:pStyle w:val="Heading2"/>
+      </w:pPr>
+      <w:bookmarkStart w:id="18" w:name="_Toc338056915"/>
+      <w:r>
+        <w:t xml:space="preserve">STB to </w:t>
+      </w:r>
+      <w:proofErr w:type="spellStart"/>
+      <w:r>
+        <w:t>v</w:t>
+      </w:r>
+      <w:r>
+        <w:t>APMAX</w:t>
+      </w:r>
+      <w:bookmarkEnd w:id="18"/>
+      <w:proofErr w:type="spellEnd"/>
+    </w:p>
+    <w:p>
+      <w:pPr>
+        <w:pStyle w:val="Heading2"/>
+      </w:pPr>
+      <w:bookmarkStart w:id="19" w:name="_Toc338056916"/>
+      <w:proofErr w:type="spellStart"/>
+      <w:proofErr w:type="gramStart"/>
+      <w:r>
+        <w:t>v</w:t>
+      </w:r>
+      <w:r>
+        <w:t>APMAX</w:t>
+      </w:r>
+      <w:proofErr w:type="spellEnd"/>
+      <w:proofErr w:type="gramEnd"/>
+      <w:r>
+        <w:t xml:space="preserve"> to Game Server</w:t>
+      </w:r>
+      <w:bookmarkEnd w:id="19"/>
+    </w:p>
+    <w:p>
+      <w:pPr>
+        <w:pStyle w:val="Heading2"/>
+      </w:pPr>
+      <w:bookmarkStart w:id="20" w:name="_Toc338056917"/>
+      <w:r>
+        <w:t xml:space="preserve">Game Server to </w:t>
+      </w:r>
+      <w:proofErr w:type="spellStart"/>
+      <w:r>
+        <w:t>v</w:t>
+      </w:r>
+      <w:r>
+        <w:t>APMAX</w:t>
+      </w:r>
+      <w:bookmarkEnd w:id="20"/>
+      <w:proofErr w:type="spellEnd"/>
+    </w:p>
+    <w:p>
+      <w:pPr>
+        <w:pStyle w:val="Heading2"/>
+      </w:pPr>
+      <w:bookmarkStart w:id="21" w:name="_Toc338056918"/>
+      <w:proofErr w:type="spellStart"/>
+      <w:proofErr w:type="gramStart"/>
+      <w:r>
+        <w:t>v</w:t>
+      </w:r>
+      <w:r>
+        <w:t>APMAX</w:t>
+      </w:r>
+      <w:proofErr w:type="spellEnd"/>
+      <w:proofErr w:type="gramEnd"/>
+      <w:r>
+        <w:t xml:space="preserve"> to STB</w:t>
+      </w:r>
+      <w:bookmarkEnd w:id="21"/>
     </w:p>
     <w:sectPr>
       <w:pgSz w:w="12240" w:h="15840"/>
@@ -1460,6 +3518,1349 @@
     </w:sectPr>
   </w:body>
 </w:document>
+</file>
+
+<file path=word/numbering.xml><?xml version="1.0" encoding="utf-8"?>
+<w:numbering xmlns:wpc="http://schemas.microsoft.com/office/word/2010/wordprocessingCanvas" xmlns:mc="http://schemas.openxmlformats.org/markup-compatibility/2006" xmlns:o="urn:schemas-microsoft-com:office:office" xmlns:r="http://schemas.openxmlformats.org/officeDocument/2006/relationships" xmlns:m="http://schemas.openxmlformats.org/officeDocument/2006/math" xmlns:v="urn:schemas-microsoft-com:vml" xmlns:wp14="http://schemas.microsoft.com/office/word/2010/wordprocessingDrawing" xmlns:wp="http://schemas.openxmlformats.org/drawingml/2006/wordprocessingDrawing" xmlns:w10="urn:schemas-microsoft-com:office:word" xmlns:w="http://schemas.openxmlformats.org/wordprocessingml/2006/main" xmlns:w14="http://schemas.microsoft.com/office/word/2010/wordml" xmlns:wpg="http://schemas.microsoft.com/office/word/2010/wordprocessingGroup" xmlns:wpi="http://schemas.microsoft.com/office/word/2010/wordprocessingInk" xmlns:wne="http://schemas.microsoft.com/office/word/2006/wordml" xmlns:wps="http://schemas.microsoft.com/office/word/2010/wordprocessingShape" mc:Ignorable="w14 wp14">
+  <w:abstractNum w:abstractNumId="0">
+    <w:nsid w:val="13B25573"/>
+    <w:multiLevelType w:val="hybridMultilevel"/>
+    <w:tmpl w:val="DFECFFC2"/>
+    <w:lvl w:ilvl="0" w:tplc="04090001">
+      <w:start w:val="1"/>
+      <w:numFmt w:val="bullet"/>
+      <w:lvlText w:val=""/>
+      <w:lvlJc w:val="left"/>
+      <w:pPr>
+        <w:ind w:left="720" w:hanging="360"/>
+      </w:pPr>
+      <w:rPr>
+        <w:rFonts w:ascii="Symbol" w:hAnsi="Symbol" w:hint="default"/>
+      </w:rPr>
+    </w:lvl>
+    <w:lvl w:ilvl="1" w:tplc="04090003" w:tentative="1">
+      <w:start w:val="1"/>
+      <w:numFmt w:val="bullet"/>
+      <w:lvlText w:val="o"/>
+      <w:lvlJc w:val="left"/>
+      <w:pPr>
+        <w:ind w:left="1440" w:hanging="360"/>
+      </w:pPr>
+      <w:rPr>
+        <w:rFonts w:ascii="Courier New" w:hAnsi="Courier New" w:cs="Courier New" w:hint="default"/>
+      </w:rPr>
+    </w:lvl>
+    <w:lvl w:ilvl="2" w:tplc="04090005" w:tentative="1">
+      <w:start w:val="1"/>
+      <w:numFmt w:val="bullet"/>
+      <w:lvlText w:val=""/>
+      <w:lvlJc w:val="left"/>
+      <w:pPr>
+        <w:ind w:left="2160" w:hanging="360"/>
+      </w:pPr>
+      <w:rPr>
+        <w:rFonts w:ascii="Wingdings" w:hAnsi="Wingdings" w:hint="default"/>
+      </w:rPr>
+    </w:lvl>
+    <w:lvl w:ilvl="3" w:tplc="04090001" w:tentative="1">
+      <w:start w:val="1"/>
+      <w:numFmt w:val="bullet"/>
+      <w:lvlText w:val=""/>
+      <w:lvlJc w:val="left"/>
+      <w:pPr>
+        <w:ind w:left="2880" w:hanging="360"/>
+      </w:pPr>
+      <w:rPr>
+        <w:rFonts w:ascii="Symbol" w:hAnsi="Symbol" w:hint="default"/>
+      </w:rPr>
+    </w:lvl>
+    <w:lvl w:ilvl="4" w:tplc="04090003" w:tentative="1">
+      <w:start w:val="1"/>
+      <w:numFmt w:val="bullet"/>
+      <w:lvlText w:val="o"/>
+      <w:lvlJc w:val="left"/>
+      <w:pPr>
+        <w:ind w:left="3600" w:hanging="360"/>
+      </w:pPr>
+      <w:rPr>
+        <w:rFonts w:ascii="Courier New" w:hAnsi="Courier New" w:cs="Courier New" w:hint="default"/>
+      </w:rPr>
+    </w:lvl>
+    <w:lvl w:ilvl="5" w:tplc="04090005" w:tentative="1">
+      <w:start w:val="1"/>
+      <w:numFmt w:val="bullet"/>
+      <w:lvlText w:val=""/>
+      <w:lvlJc w:val="left"/>
+      <w:pPr>
+        <w:ind w:left="4320" w:hanging="360"/>
+      </w:pPr>
+      <w:rPr>
+        <w:rFonts w:ascii="Wingdings" w:hAnsi="Wingdings" w:hint="default"/>
+      </w:rPr>
+    </w:lvl>
+    <w:lvl w:ilvl="6" w:tplc="04090001" w:tentative="1">
+      <w:start w:val="1"/>
+      <w:numFmt w:val="bullet"/>
+      <w:lvlText w:val=""/>
+      <w:lvlJc w:val="left"/>
+      <w:pPr>
+        <w:ind w:left="5040" w:hanging="360"/>
+      </w:pPr>
+      <w:rPr>
+        <w:rFonts w:ascii="Symbol" w:hAnsi="Symbol" w:hint="default"/>
+      </w:rPr>
+    </w:lvl>
+    <w:lvl w:ilvl="7" w:tplc="04090003" w:tentative="1">
+      <w:start w:val="1"/>
+      <w:numFmt w:val="bullet"/>
+      <w:lvlText w:val="o"/>
+      <w:lvlJc w:val="left"/>
+      <w:pPr>
+        <w:ind w:left="5760" w:hanging="360"/>
+      </w:pPr>
+      <w:rPr>
+        <w:rFonts w:ascii="Courier New" w:hAnsi="Courier New" w:cs="Courier New" w:hint="default"/>
+      </w:rPr>
+    </w:lvl>
+    <w:lvl w:ilvl="8" w:tplc="04090005" w:tentative="1">
+      <w:start w:val="1"/>
+      <w:numFmt w:val="bullet"/>
+      <w:lvlText w:val=""/>
+      <w:lvlJc w:val="left"/>
+      <w:pPr>
+        <w:ind w:left="6480" w:hanging="360"/>
+      </w:pPr>
+      <w:rPr>
+        <w:rFonts w:ascii="Wingdings" w:hAnsi="Wingdings" w:hint="default"/>
+      </w:rPr>
+    </w:lvl>
+  </w:abstractNum>
+  <w:abstractNum w:abstractNumId="1">
+    <w:nsid w:val="1CBA4DD7"/>
+    <w:multiLevelType w:val="hybridMultilevel"/>
+    <w:tmpl w:val="FA10C7BC"/>
+    <w:lvl w:ilvl="0" w:tplc="0409000F">
+      <w:start w:val="1"/>
+      <w:numFmt w:val="decimal"/>
+      <w:lvlText w:val="%1."/>
+      <w:lvlJc w:val="left"/>
+      <w:pPr>
+        <w:ind w:left="720" w:hanging="360"/>
+      </w:pPr>
+    </w:lvl>
+    <w:lvl w:ilvl="1" w:tplc="04090019" w:tentative="1">
+      <w:start w:val="1"/>
+      <w:numFmt w:val="lowerLetter"/>
+      <w:lvlText w:val="%2."/>
+      <w:lvlJc w:val="left"/>
+      <w:pPr>
+        <w:ind w:left="1440" w:hanging="360"/>
+      </w:pPr>
+    </w:lvl>
+    <w:lvl w:ilvl="2" w:tplc="0409001B" w:tentative="1">
+      <w:start w:val="1"/>
+      <w:numFmt w:val="lowerRoman"/>
+      <w:lvlText w:val="%3."/>
+      <w:lvlJc w:val="right"/>
+      <w:pPr>
+        <w:ind w:left="2160" w:hanging="180"/>
+      </w:pPr>
+    </w:lvl>
+    <w:lvl w:ilvl="3" w:tplc="0409000F" w:tentative="1">
+      <w:start w:val="1"/>
+      <w:numFmt w:val="decimal"/>
+      <w:lvlText w:val="%4."/>
+      <w:lvlJc w:val="left"/>
+      <w:pPr>
+        <w:ind w:left="2880" w:hanging="360"/>
+      </w:pPr>
+    </w:lvl>
+    <w:lvl w:ilvl="4" w:tplc="04090019" w:tentative="1">
+      <w:start w:val="1"/>
+      <w:numFmt w:val="lowerLetter"/>
+      <w:lvlText w:val="%5."/>
+      <w:lvlJc w:val="left"/>
+      <w:pPr>
+        <w:ind w:left="3600" w:hanging="360"/>
+      </w:pPr>
+    </w:lvl>
+    <w:lvl w:ilvl="5" w:tplc="0409001B" w:tentative="1">
+      <w:start w:val="1"/>
+      <w:numFmt w:val="lowerRoman"/>
+      <w:lvlText w:val="%6."/>
+      <w:lvlJc w:val="right"/>
+      <w:pPr>
+        <w:ind w:left="4320" w:hanging="180"/>
+      </w:pPr>
+    </w:lvl>
+    <w:lvl w:ilvl="6" w:tplc="0409000F" w:tentative="1">
+      <w:start w:val="1"/>
+      <w:numFmt w:val="decimal"/>
+      <w:lvlText w:val="%7."/>
+      <w:lvlJc w:val="left"/>
+      <w:pPr>
+        <w:ind w:left="5040" w:hanging="360"/>
+      </w:pPr>
+    </w:lvl>
+    <w:lvl w:ilvl="7" w:tplc="04090019" w:tentative="1">
+      <w:start w:val="1"/>
+      <w:numFmt w:val="lowerLetter"/>
+      <w:lvlText w:val="%8."/>
+      <w:lvlJc w:val="left"/>
+      <w:pPr>
+        <w:ind w:left="5760" w:hanging="360"/>
+      </w:pPr>
+    </w:lvl>
+    <w:lvl w:ilvl="8" w:tplc="0409001B" w:tentative="1">
+      <w:start w:val="1"/>
+      <w:numFmt w:val="lowerRoman"/>
+      <w:lvlText w:val="%9."/>
+      <w:lvlJc w:val="right"/>
+      <w:pPr>
+        <w:ind w:left="6480" w:hanging="180"/>
+      </w:pPr>
+    </w:lvl>
+  </w:abstractNum>
+  <w:abstractNum w:abstractNumId="2">
+    <w:nsid w:val="200647A7"/>
+    <w:multiLevelType w:val="hybridMultilevel"/>
+    <w:tmpl w:val="3EA844E0"/>
+    <w:lvl w:ilvl="0" w:tplc="04090001">
+      <w:start w:val="1"/>
+      <w:numFmt w:val="bullet"/>
+      <w:lvlText w:val=""/>
+      <w:lvlJc w:val="left"/>
+      <w:pPr>
+        <w:ind w:left="720" w:hanging="360"/>
+      </w:pPr>
+      <w:rPr>
+        <w:rFonts w:ascii="Symbol" w:hAnsi="Symbol" w:hint="default"/>
+      </w:rPr>
+    </w:lvl>
+    <w:lvl w:ilvl="1" w:tplc="04090003">
+      <w:start w:val="1"/>
+      <w:numFmt w:val="bullet"/>
+      <w:lvlText w:val="o"/>
+      <w:lvlJc w:val="left"/>
+      <w:pPr>
+        <w:ind w:left="1440" w:hanging="360"/>
+      </w:pPr>
+      <w:rPr>
+        <w:rFonts w:ascii="Courier New" w:hAnsi="Courier New" w:cs="Courier New" w:hint="default"/>
+      </w:rPr>
+    </w:lvl>
+    <w:lvl w:ilvl="2" w:tplc="04090005" w:tentative="1">
+      <w:start w:val="1"/>
+      <w:numFmt w:val="bullet"/>
+      <w:lvlText w:val=""/>
+      <w:lvlJc w:val="left"/>
+      <w:pPr>
+        <w:ind w:left="2160" w:hanging="360"/>
+      </w:pPr>
+      <w:rPr>
+        <w:rFonts w:ascii="Wingdings" w:hAnsi="Wingdings" w:hint="default"/>
+      </w:rPr>
+    </w:lvl>
+    <w:lvl w:ilvl="3" w:tplc="04090001" w:tentative="1">
+      <w:start w:val="1"/>
+      <w:numFmt w:val="bullet"/>
+      <w:lvlText w:val=""/>
+      <w:lvlJc w:val="left"/>
+      <w:pPr>
+        <w:ind w:left="2880" w:hanging="360"/>
+      </w:pPr>
+      <w:rPr>
+        <w:rFonts w:ascii="Symbol" w:hAnsi="Symbol" w:hint="default"/>
+      </w:rPr>
+    </w:lvl>
+    <w:lvl w:ilvl="4" w:tplc="04090003" w:tentative="1">
+      <w:start w:val="1"/>
+      <w:numFmt w:val="bullet"/>
+      <w:lvlText w:val="o"/>
+      <w:lvlJc w:val="left"/>
+      <w:pPr>
+        <w:ind w:left="3600" w:hanging="360"/>
+      </w:pPr>
+      <w:rPr>
+        <w:rFonts w:ascii="Courier New" w:hAnsi="Courier New" w:cs="Courier New" w:hint="default"/>
+      </w:rPr>
+    </w:lvl>
+    <w:lvl w:ilvl="5" w:tplc="04090005" w:tentative="1">
+      <w:start w:val="1"/>
+      <w:numFmt w:val="bullet"/>
+      <w:lvlText w:val=""/>
+      <w:lvlJc w:val="left"/>
+      <w:pPr>
+        <w:ind w:left="4320" w:hanging="360"/>
+      </w:pPr>
+      <w:rPr>
+        <w:rFonts w:ascii="Wingdings" w:hAnsi="Wingdings" w:hint="default"/>
+      </w:rPr>
+    </w:lvl>
+    <w:lvl w:ilvl="6" w:tplc="04090001" w:tentative="1">
+      <w:start w:val="1"/>
+      <w:numFmt w:val="bullet"/>
+      <w:lvlText w:val=""/>
+      <w:lvlJc w:val="left"/>
+      <w:pPr>
+        <w:ind w:left="5040" w:hanging="360"/>
+      </w:pPr>
+      <w:rPr>
+        <w:rFonts w:ascii="Symbol" w:hAnsi="Symbol" w:hint="default"/>
+      </w:rPr>
+    </w:lvl>
+    <w:lvl w:ilvl="7" w:tplc="04090003" w:tentative="1">
+      <w:start w:val="1"/>
+      <w:numFmt w:val="bullet"/>
+      <w:lvlText w:val="o"/>
+      <w:lvlJc w:val="left"/>
+      <w:pPr>
+        <w:ind w:left="5760" w:hanging="360"/>
+      </w:pPr>
+      <w:rPr>
+        <w:rFonts w:ascii="Courier New" w:hAnsi="Courier New" w:cs="Courier New" w:hint="default"/>
+      </w:rPr>
+    </w:lvl>
+    <w:lvl w:ilvl="8" w:tplc="04090005" w:tentative="1">
+      <w:start w:val="1"/>
+      <w:numFmt w:val="bullet"/>
+      <w:lvlText w:val=""/>
+      <w:lvlJc w:val="left"/>
+      <w:pPr>
+        <w:ind w:left="6480" w:hanging="360"/>
+      </w:pPr>
+      <w:rPr>
+        <w:rFonts w:ascii="Wingdings" w:hAnsi="Wingdings" w:hint="default"/>
+      </w:rPr>
+    </w:lvl>
+  </w:abstractNum>
+  <w:abstractNum w:abstractNumId="3">
+    <w:nsid w:val="2D1A68B1"/>
+    <w:multiLevelType w:val="hybridMultilevel"/>
+    <w:tmpl w:val="5134B2AC"/>
+    <w:lvl w:ilvl="0" w:tplc="04090001">
+      <w:start w:val="1"/>
+      <w:numFmt w:val="bullet"/>
+      <w:lvlText w:val=""/>
+      <w:lvlJc w:val="left"/>
+      <w:pPr>
+        <w:ind w:left="720" w:hanging="360"/>
+      </w:pPr>
+      <w:rPr>
+        <w:rFonts w:ascii="Symbol" w:hAnsi="Symbol" w:hint="default"/>
+      </w:rPr>
+    </w:lvl>
+    <w:lvl w:ilvl="1" w:tplc="04090003">
+      <w:start w:val="1"/>
+      <w:numFmt w:val="bullet"/>
+      <w:lvlText w:val="o"/>
+      <w:lvlJc w:val="left"/>
+      <w:pPr>
+        <w:ind w:left="1440" w:hanging="360"/>
+      </w:pPr>
+      <w:rPr>
+        <w:rFonts w:ascii="Courier New" w:hAnsi="Courier New" w:cs="Courier New" w:hint="default"/>
+      </w:rPr>
+    </w:lvl>
+    <w:lvl w:ilvl="2" w:tplc="04090005" w:tentative="1">
+      <w:start w:val="1"/>
+      <w:numFmt w:val="bullet"/>
+      <w:lvlText w:val=""/>
+      <w:lvlJc w:val="left"/>
+      <w:pPr>
+        <w:ind w:left="2160" w:hanging="360"/>
+      </w:pPr>
+      <w:rPr>
+        <w:rFonts w:ascii="Wingdings" w:hAnsi="Wingdings" w:hint="default"/>
+      </w:rPr>
+    </w:lvl>
+    <w:lvl w:ilvl="3" w:tplc="04090001" w:tentative="1">
+      <w:start w:val="1"/>
+      <w:numFmt w:val="bullet"/>
+      <w:lvlText w:val=""/>
+      <w:lvlJc w:val="left"/>
+      <w:pPr>
+        <w:ind w:left="2880" w:hanging="360"/>
+      </w:pPr>
+      <w:rPr>
+        <w:rFonts w:ascii="Symbol" w:hAnsi="Symbol" w:hint="default"/>
+      </w:rPr>
+    </w:lvl>
+    <w:lvl w:ilvl="4" w:tplc="04090003" w:tentative="1">
+      <w:start w:val="1"/>
+      <w:numFmt w:val="bullet"/>
+      <w:lvlText w:val="o"/>
+      <w:lvlJc w:val="left"/>
+      <w:pPr>
+        <w:ind w:left="3600" w:hanging="360"/>
+      </w:pPr>
+      <w:rPr>
+        <w:rFonts w:ascii="Courier New" w:hAnsi="Courier New" w:cs="Courier New" w:hint="default"/>
+      </w:rPr>
+    </w:lvl>
+    <w:lvl w:ilvl="5" w:tplc="04090005" w:tentative="1">
+      <w:start w:val="1"/>
+      <w:numFmt w:val="bullet"/>
+      <w:lvlText w:val=""/>
+      <w:lvlJc w:val="left"/>
+      <w:pPr>
+        <w:ind w:left="4320" w:hanging="360"/>
+      </w:pPr>
+      <w:rPr>
+        <w:rFonts w:ascii="Wingdings" w:hAnsi="Wingdings" w:hint="default"/>
+      </w:rPr>
+    </w:lvl>
+    <w:lvl w:ilvl="6" w:tplc="04090001" w:tentative="1">
+      <w:start w:val="1"/>
+      <w:numFmt w:val="bullet"/>
+      <w:lvlText w:val=""/>
+      <w:lvlJc w:val="left"/>
+      <w:pPr>
+        <w:ind w:left="5040" w:hanging="360"/>
+      </w:pPr>
+      <w:rPr>
+        <w:rFonts w:ascii="Symbol" w:hAnsi="Symbol" w:hint="default"/>
+      </w:rPr>
+    </w:lvl>
+    <w:lvl w:ilvl="7" w:tplc="04090003" w:tentative="1">
+      <w:start w:val="1"/>
+      <w:numFmt w:val="bullet"/>
+      <w:lvlText w:val="o"/>
+      <w:lvlJc w:val="left"/>
+      <w:pPr>
+        <w:ind w:left="5760" w:hanging="360"/>
+      </w:pPr>
+      <w:rPr>
+        <w:rFonts w:ascii="Courier New" w:hAnsi="Courier New" w:cs="Courier New" w:hint="default"/>
+      </w:rPr>
+    </w:lvl>
+    <w:lvl w:ilvl="8" w:tplc="04090005" w:tentative="1">
+      <w:start w:val="1"/>
+      <w:numFmt w:val="bullet"/>
+      <w:lvlText w:val=""/>
+      <w:lvlJc w:val="left"/>
+      <w:pPr>
+        <w:ind w:left="6480" w:hanging="360"/>
+      </w:pPr>
+      <w:rPr>
+        <w:rFonts w:ascii="Wingdings" w:hAnsi="Wingdings" w:hint="default"/>
+      </w:rPr>
+    </w:lvl>
+  </w:abstractNum>
+  <w:abstractNum w:abstractNumId="4">
+    <w:nsid w:val="2DAD713C"/>
+    <w:multiLevelType w:val="hybridMultilevel"/>
+    <w:tmpl w:val="A8AEB3C8"/>
+    <w:lvl w:ilvl="0" w:tplc="04090001">
+      <w:start w:val="1"/>
+      <w:numFmt w:val="bullet"/>
+      <w:lvlText w:val=""/>
+      <w:lvlJc w:val="left"/>
+      <w:pPr>
+        <w:ind w:left="720" w:hanging="360"/>
+      </w:pPr>
+      <w:rPr>
+        <w:rFonts w:ascii="Symbol" w:hAnsi="Symbol" w:hint="default"/>
+      </w:rPr>
+    </w:lvl>
+    <w:lvl w:ilvl="1" w:tplc="04090003" w:tentative="1">
+      <w:start w:val="1"/>
+      <w:numFmt w:val="bullet"/>
+      <w:lvlText w:val="o"/>
+      <w:lvlJc w:val="left"/>
+      <w:pPr>
+        <w:ind w:left="1440" w:hanging="360"/>
+      </w:pPr>
+      <w:rPr>
+        <w:rFonts w:ascii="Courier New" w:hAnsi="Courier New" w:cs="Courier New" w:hint="default"/>
+      </w:rPr>
+    </w:lvl>
+    <w:lvl w:ilvl="2" w:tplc="04090005" w:tentative="1">
+      <w:start w:val="1"/>
+      <w:numFmt w:val="bullet"/>
+      <w:lvlText w:val=""/>
+      <w:lvlJc w:val="left"/>
+      <w:pPr>
+        <w:ind w:left="2160" w:hanging="360"/>
+      </w:pPr>
+      <w:rPr>
+        <w:rFonts w:ascii="Wingdings" w:hAnsi="Wingdings" w:hint="default"/>
+      </w:rPr>
+    </w:lvl>
+    <w:lvl w:ilvl="3" w:tplc="04090001" w:tentative="1">
+      <w:start w:val="1"/>
+      <w:numFmt w:val="bullet"/>
+      <w:lvlText w:val=""/>
+      <w:lvlJc w:val="left"/>
+      <w:pPr>
+        <w:ind w:left="2880" w:hanging="360"/>
+      </w:pPr>
+      <w:rPr>
+        <w:rFonts w:ascii="Symbol" w:hAnsi="Symbol" w:hint="default"/>
+      </w:rPr>
+    </w:lvl>
+    <w:lvl w:ilvl="4" w:tplc="04090003" w:tentative="1">
+      <w:start w:val="1"/>
+      <w:numFmt w:val="bullet"/>
+      <w:lvlText w:val="o"/>
+      <w:lvlJc w:val="left"/>
+      <w:pPr>
+        <w:ind w:left="3600" w:hanging="360"/>
+      </w:pPr>
+      <w:rPr>
+        <w:rFonts w:ascii="Courier New" w:hAnsi="Courier New" w:cs="Courier New" w:hint="default"/>
+      </w:rPr>
+    </w:lvl>
+    <w:lvl w:ilvl="5" w:tplc="04090005" w:tentative="1">
+      <w:start w:val="1"/>
+      <w:numFmt w:val="bullet"/>
+      <w:lvlText w:val=""/>
+      <w:lvlJc w:val="left"/>
+      <w:pPr>
+        <w:ind w:left="4320" w:hanging="360"/>
+      </w:pPr>
+      <w:rPr>
+        <w:rFonts w:ascii="Wingdings" w:hAnsi="Wingdings" w:hint="default"/>
+      </w:rPr>
+    </w:lvl>
+    <w:lvl w:ilvl="6" w:tplc="04090001" w:tentative="1">
+      <w:start w:val="1"/>
+      <w:numFmt w:val="bullet"/>
+      <w:lvlText w:val=""/>
+      <w:lvlJc w:val="left"/>
+      <w:pPr>
+        <w:ind w:left="5040" w:hanging="360"/>
+      </w:pPr>
+      <w:rPr>
+        <w:rFonts w:ascii="Symbol" w:hAnsi="Symbol" w:hint="default"/>
+      </w:rPr>
+    </w:lvl>
+    <w:lvl w:ilvl="7" w:tplc="04090003" w:tentative="1">
+      <w:start w:val="1"/>
+      <w:numFmt w:val="bullet"/>
+      <w:lvlText w:val="o"/>
+      <w:lvlJc w:val="left"/>
+      <w:pPr>
+        <w:ind w:left="5760" w:hanging="360"/>
+      </w:pPr>
+      <w:rPr>
+        <w:rFonts w:ascii="Courier New" w:hAnsi="Courier New" w:cs="Courier New" w:hint="default"/>
+      </w:rPr>
+    </w:lvl>
+    <w:lvl w:ilvl="8" w:tplc="04090005" w:tentative="1">
+      <w:start w:val="1"/>
+      <w:numFmt w:val="bullet"/>
+      <w:lvlText w:val=""/>
+      <w:lvlJc w:val="left"/>
+      <w:pPr>
+        <w:ind w:left="6480" w:hanging="360"/>
+      </w:pPr>
+      <w:rPr>
+        <w:rFonts w:ascii="Wingdings" w:hAnsi="Wingdings" w:hint="default"/>
+      </w:rPr>
+    </w:lvl>
+  </w:abstractNum>
+  <w:abstractNum w:abstractNumId="5">
+    <w:nsid w:val="39E25159"/>
+    <w:multiLevelType w:val="hybridMultilevel"/>
+    <w:tmpl w:val="F2986884"/>
+    <w:lvl w:ilvl="0" w:tplc="04090001">
+      <w:start w:val="1"/>
+      <w:numFmt w:val="bullet"/>
+      <w:lvlText w:val=""/>
+      <w:lvlJc w:val="left"/>
+      <w:pPr>
+        <w:ind w:left="720" w:hanging="360"/>
+      </w:pPr>
+      <w:rPr>
+        <w:rFonts w:ascii="Symbol" w:hAnsi="Symbol" w:hint="default"/>
+      </w:rPr>
+    </w:lvl>
+    <w:lvl w:ilvl="1" w:tplc="04090003" w:tentative="1">
+      <w:start w:val="1"/>
+      <w:numFmt w:val="bullet"/>
+      <w:lvlText w:val="o"/>
+      <w:lvlJc w:val="left"/>
+      <w:pPr>
+        <w:ind w:left="1440" w:hanging="360"/>
+      </w:pPr>
+      <w:rPr>
+        <w:rFonts w:ascii="Courier New" w:hAnsi="Courier New" w:cs="Courier New" w:hint="default"/>
+      </w:rPr>
+    </w:lvl>
+    <w:lvl w:ilvl="2" w:tplc="04090005" w:tentative="1">
+      <w:start w:val="1"/>
+      <w:numFmt w:val="bullet"/>
+      <w:lvlText w:val=""/>
+      <w:lvlJc w:val="left"/>
+      <w:pPr>
+        <w:ind w:left="2160" w:hanging="360"/>
+      </w:pPr>
+      <w:rPr>
+        <w:rFonts w:ascii="Wingdings" w:hAnsi="Wingdings" w:hint="default"/>
+      </w:rPr>
+    </w:lvl>
+    <w:lvl w:ilvl="3" w:tplc="04090001" w:tentative="1">
+      <w:start w:val="1"/>
+      <w:numFmt w:val="bullet"/>
+      <w:lvlText w:val=""/>
+      <w:lvlJc w:val="left"/>
+      <w:pPr>
+        <w:ind w:left="2880" w:hanging="360"/>
+      </w:pPr>
+      <w:rPr>
+        <w:rFonts w:ascii="Symbol" w:hAnsi="Symbol" w:hint="default"/>
+      </w:rPr>
+    </w:lvl>
+    <w:lvl w:ilvl="4" w:tplc="04090003" w:tentative="1">
+      <w:start w:val="1"/>
+      <w:numFmt w:val="bullet"/>
+      <w:lvlText w:val="o"/>
+      <w:lvlJc w:val="left"/>
+      <w:pPr>
+        <w:ind w:left="3600" w:hanging="360"/>
+      </w:pPr>
+      <w:rPr>
+        <w:rFonts w:ascii="Courier New" w:hAnsi="Courier New" w:cs="Courier New" w:hint="default"/>
+      </w:rPr>
+    </w:lvl>
+    <w:lvl w:ilvl="5" w:tplc="04090005" w:tentative="1">
+      <w:start w:val="1"/>
+      <w:numFmt w:val="bullet"/>
+      <w:lvlText w:val=""/>
+      <w:lvlJc w:val="left"/>
+      <w:pPr>
+        <w:ind w:left="4320" w:hanging="360"/>
+      </w:pPr>
+      <w:rPr>
+        <w:rFonts w:ascii="Wingdings" w:hAnsi="Wingdings" w:hint="default"/>
+      </w:rPr>
+    </w:lvl>
+    <w:lvl w:ilvl="6" w:tplc="04090001" w:tentative="1">
+      <w:start w:val="1"/>
+      <w:numFmt w:val="bullet"/>
+      <w:lvlText w:val=""/>
+      <w:lvlJc w:val="left"/>
+      <w:pPr>
+        <w:ind w:left="5040" w:hanging="360"/>
+      </w:pPr>
+      <w:rPr>
+        <w:rFonts w:ascii="Symbol" w:hAnsi="Symbol" w:hint="default"/>
+      </w:rPr>
+    </w:lvl>
+    <w:lvl w:ilvl="7" w:tplc="04090003" w:tentative="1">
+      <w:start w:val="1"/>
+      <w:numFmt w:val="bullet"/>
+      <w:lvlText w:val="o"/>
+      <w:lvlJc w:val="left"/>
+      <w:pPr>
+        <w:ind w:left="5760" w:hanging="360"/>
+      </w:pPr>
+      <w:rPr>
+        <w:rFonts w:ascii="Courier New" w:hAnsi="Courier New" w:cs="Courier New" w:hint="default"/>
+      </w:rPr>
+    </w:lvl>
+    <w:lvl w:ilvl="8" w:tplc="04090005" w:tentative="1">
+      <w:start w:val="1"/>
+      <w:numFmt w:val="bullet"/>
+      <w:lvlText w:val=""/>
+      <w:lvlJc w:val="left"/>
+      <w:pPr>
+        <w:ind w:left="6480" w:hanging="360"/>
+      </w:pPr>
+      <w:rPr>
+        <w:rFonts w:ascii="Wingdings" w:hAnsi="Wingdings" w:hint="default"/>
+      </w:rPr>
+    </w:lvl>
+  </w:abstractNum>
+  <w:abstractNum w:abstractNumId="6">
+    <w:nsid w:val="49697A18"/>
+    <w:multiLevelType w:val="hybridMultilevel"/>
+    <w:tmpl w:val="EAE61E5E"/>
+    <w:lvl w:ilvl="0" w:tplc="04090001">
+      <w:start w:val="1"/>
+      <w:numFmt w:val="bullet"/>
+      <w:lvlText w:val=""/>
+      <w:lvlJc w:val="left"/>
+      <w:pPr>
+        <w:ind w:left="720" w:hanging="360"/>
+      </w:pPr>
+      <w:rPr>
+        <w:rFonts w:ascii="Symbol" w:hAnsi="Symbol" w:hint="default"/>
+      </w:rPr>
+    </w:lvl>
+    <w:lvl w:ilvl="1" w:tplc="04090003">
+      <w:start w:val="1"/>
+      <w:numFmt w:val="bullet"/>
+      <w:lvlText w:val="o"/>
+      <w:lvlJc w:val="left"/>
+      <w:pPr>
+        <w:ind w:left="1440" w:hanging="360"/>
+      </w:pPr>
+      <w:rPr>
+        <w:rFonts w:ascii="Courier New" w:hAnsi="Courier New" w:cs="Courier New" w:hint="default"/>
+      </w:rPr>
+    </w:lvl>
+    <w:lvl w:ilvl="2" w:tplc="04090005" w:tentative="1">
+      <w:start w:val="1"/>
+      <w:numFmt w:val="bullet"/>
+      <w:lvlText w:val=""/>
+      <w:lvlJc w:val="left"/>
+      <w:pPr>
+        <w:ind w:left="2160" w:hanging="360"/>
+      </w:pPr>
+      <w:rPr>
+        <w:rFonts w:ascii="Wingdings" w:hAnsi="Wingdings" w:hint="default"/>
+      </w:rPr>
+    </w:lvl>
+    <w:lvl w:ilvl="3" w:tplc="04090001" w:tentative="1">
+      <w:start w:val="1"/>
+      <w:numFmt w:val="bullet"/>
+      <w:lvlText w:val=""/>
+      <w:lvlJc w:val="left"/>
+      <w:pPr>
+        <w:ind w:left="2880" w:hanging="360"/>
+      </w:pPr>
+      <w:rPr>
+        <w:rFonts w:ascii="Symbol" w:hAnsi="Symbol" w:hint="default"/>
+      </w:rPr>
+    </w:lvl>
+    <w:lvl w:ilvl="4" w:tplc="04090003" w:tentative="1">
+      <w:start w:val="1"/>
+      <w:numFmt w:val="bullet"/>
+      <w:lvlText w:val="o"/>
+      <w:lvlJc w:val="left"/>
+      <w:pPr>
+        <w:ind w:left="3600" w:hanging="360"/>
+      </w:pPr>
+      <w:rPr>
+        <w:rFonts w:ascii="Courier New" w:hAnsi="Courier New" w:cs="Courier New" w:hint="default"/>
+      </w:rPr>
+    </w:lvl>
+    <w:lvl w:ilvl="5" w:tplc="04090005" w:tentative="1">
+      <w:start w:val="1"/>
+      <w:numFmt w:val="bullet"/>
+      <w:lvlText w:val=""/>
+      <w:lvlJc w:val="left"/>
+      <w:pPr>
+        <w:ind w:left="4320" w:hanging="360"/>
+      </w:pPr>
+      <w:rPr>
+        <w:rFonts w:ascii="Wingdings" w:hAnsi="Wingdings" w:hint="default"/>
+      </w:rPr>
+    </w:lvl>
+    <w:lvl w:ilvl="6" w:tplc="04090001" w:tentative="1">
+      <w:start w:val="1"/>
+      <w:numFmt w:val="bullet"/>
+      <w:lvlText w:val=""/>
+      <w:lvlJc w:val="left"/>
+      <w:pPr>
+        <w:ind w:left="5040" w:hanging="360"/>
+      </w:pPr>
+      <w:rPr>
+        <w:rFonts w:ascii="Symbol" w:hAnsi="Symbol" w:hint="default"/>
+      </w:rPr>
+    </w:lvl>
+    <w:lvl w:ilvl="7" w:tplc="04090003" w:tentative="1">
+      <w:start w:val="1"/>
+      <w:numFmt w:val="bullet"/>
+      <w:lvlText w:val="o"/>
+      <w:lvlJc w:val="left"/>
+      <w:pPr>
+        <w:ind w:left="5760" w:hanging="360"/>
+      </w:pPr>
+      <w:rPr>
+        <w:rFonts w:ascii="Courier New" w:hAnsi="Courier New" w:cs="Courier New" w:hint="default"/>
+      </w:rPr>
+    </w:lvl>
+    <w:lvl w:ilvl="8" w:tplc="04090005" w:tentative="1">
+      <w:start w:val="1"/>
+      <w:numFmt w:val="bullet"/>
+      <w:lvlText w:val=""/>
+      <w:lvlJc w:val="left"/>
+      <w:pPr>
+        <w:ind w:left="6480" w:hanging="360"/>
+      </w:pPr>
+      <w:rPr>
+        <w:rFonts w:ascii="Wingdings" w:hAnsi="Wingdings" w:hint="default"/>
+      </w:rPr>
+    </w:lvl>
+  </w:abstractNum>
+  <w:abstractNum w:abstractNumId="7">
+    <w:nsid w:val="4FD15805"/>
+    <w:multiLevelType w:val="hybridMultilevel"/>
+    <w:tmpl w:val="2426420C"/>
+    <w:lvl w:ilvl="0" w:tplc="0409000F">
+      <w:start w:val="1"/>
+      <w:numFmt w:val="decimal"/>
+      <w:lvlText w:val="%1."/>
+      <w:lvlJc w:val="left"/>
+      <w:pPr>
+        <w:ind w:left="720" w:hanging="360"/>
+      </w:pPr>
+      <w:rPr>
+        <w:rFonts w:hint="default"/>
+      </w:rPr>
+    </w:lvl>
+    <w:lvl w:ilvl="1" w:tplc="04090003" w:tentative="1">
+      <w:start w:val="1"/>
+      <w:numFmt w:val="bullet"/>
+      <w:lvlText w:val="o"/>
+      <w:lvlJc w:val="left"/>
+      <w:pPr>
+        <w:ind w:left="1440" w:hanging="360"/>
+      </w:pPr>
+      <w:rPr>
+        <w:rFonts w:ascii="Courier New" w:hAnsi="Courier New" w:cs="Courier New" w:hint="default"/>
+      </w:rPr>
+    </w:lvl>
+    <w:lvl w:ilvl="2" w:tplc="04090005" w:tentative="1">
+      <w:start w:val="1"/>
+      <w:numFmt w:val="bullet"/>
+      <w:lvlText w:val=""/>
+      <w:lvlJc w:val="left"/>
+      <w:pPr>
+        <w:ind w:left="2160" w:hanging="360"/>
+      </w:pPr>
+      <w:rPr>
+        <w:rFonts w:ascii="Wingdings" w:hAnsi="Wingdings" w:hint="default"/>
+      </w:rPr>
+    </w:lvl>
+    <w:lvl w:ilvl="3" w:tplc="04090001" w:tentative="1">
+      <w:start w:val="1"/>
+      <w:numFmt w:val="bullet"/>
+      <w:lvlText w:val=""/>
+      <w:lvlJc w:val="left"/>
+      <w:pPr>
+        <w:ind w:left="2880" w:hanging="360"/>
+      </w:pPr>
+      <w:rPr>
+        <w:rFonts w:ascii="Symbol" w:hAnsi="Symbol" w:hint="default"/>
+      </w:rPr>
+    </w:lvl>
+    <w:lvl w:ilvl="4" w:tplc="04090003" w:tentative="1">
+      <w:start w:val="1"/>
+      <w:numFmt w:val="bullet"/>
+      <w:lvlText w:val="o"/>
+      <w:lvlJc w:val="left"/>
+      <w:pPr>
+        <w:ind w:left="3600" w:hanging="360"/>
+      </w:pPr>
+      <w:rPr>
+        <w:rFonts w:ascii="Courier New" w:hAnsi="Courier New" w:cs="Courier New" w:hint="default"/>
+      </w:rPr>
+    </w:lvl>
+    <w:lvl w:ilvl="5" w:tplc="04090005" w:tentative="1">
+      <w:start w:val="1"/>
+      <w:numFmt w:val="bullet"/>
+      <w:lvlText w:val=""/>
+      <w:lvlJc w:val="left"/>
+      <w:pPr>
+        <w:ind w:left="4320" w:hanging="360"/>
+      </w:pPr>
+      <w:rPr>
+        <w:rFonts w:ascii="Wingdings" w:hAnsi="Wingdings" w:hint="default"/>
+      </w:rPr>
+    </w:lvl>
+    <w:lvl w:ilvl="6" w:tplc="04090001" w:tentative="1">
+      <w:start w:val="1"/>
+      <w:numFmt w:val="bullet"/>
+      <w:lvlText w:val=""/>
+      <w:lvlJc w:val="left"/>
+      <w:pPr>
+        <w:ind w:left="5040" w:hanging="360"/>
+      </w:pPr>
+      <w:rPr>
+        <w:rFonts w:ascii="Symbol" w:hAnsi="Symbol" w:hint="default"/>
+      </w:rPr>
+    </w:lvl>
+    <w:lvl w:ilvl="7" w:tplc="04090003" w:tentative="1">
+      <w:start w:val="1"/>
+      <w:numFmt w:val="bullet"/>
+      <w:lvlText w:val="o"/>
+      <w:lvlJc w:val="left"/>
+      <w:pPr>
+        <w:ind w:left="5760" w:hanging="360"/>
+      </w:pPr>
+      <w:rPr>
+        <w:rFonts w:ascii="Courier New" w:hAnsi="Courier New" w:cs="Courier New" w:hint="default"/>
+      </w:rPr>
+    </w:lvl>
+    <w:lvl w:ilvl="8" w:tplc="04090005" w:tentative="1">
+      <w:start w:val="1"/>
+      <w:numFmt w:val="bullet"/>
+      <w:lvlText w:val=""/>
+      <w:lvlJc w:val="left"/>
+      <w:pPr>
+        <w:ind w:left="6480" w:hanging="360"/>
+      </w:pPr>
+      <w:rPr>
+        <w:rFonts w:ascii="Wingdings" w:hAnsi="Wingdings" w:hint="default"/>
+      </w:rPr>
+    </w:lvl>
+  </w:abstractNum>
+  <w:abstractNum w:abstractNumId="8">
+    <w:nsid w:val="5002136E"/>
+    <w:multiLevelType w:val="hybridMultilevel"/>
+    <w:tmpl w:val="245EA418"/>
+    <w:lvl w:ilvl="0" w:tplc="04090001">
+      <w:start w:val="1"/>
+      <w:numFmt w:val="bullet"/>
+      <w:lvlText w:val=""/>
+      <w:lvlJc w:val="left"/>
+      <w:pPr>
+        <w:ind w:left="720" w:hanging="360"/>
+      </w:pPr>
+      <w:rPr>
+        <w:rFonts w:ascii="Symbol" w:hAnsi="Symbol" w:hint="default"/>
+      </w:rPr>
+    </w:lvl>
+    <w:lvl w:ilvl="1" w:tplc="04090003">
+      <w:start w:val="1"/>
+      <w:numFmt w:val="bullet"/>
+      <w:lvlText w:val="o"/>
+      <w:lvlJc w:val="left"/>
+      <w:pPr>
+        <w:ind w:left="1440" w:hanging="360"/>
+      </w:pPr>
+      <w:rPr>
+        <w:rFonts w:ascii="Courier New" w:hAnsi="Courier New" w:cs="Courier New" w:hint="default"/>
+      </w:rPr>
+    </w:lvl>
+    <w:lvl w:ilvl="2" w:tplc="04090005" w:tentative="1">
+      <w:start w:val="1"/>
+      <w:numFmt w:val="bullet"/>
+      <w:lvlText w:val=""/>
+      <w:lvlJc w:val="left"/>
+      <w:pPr>
+        <w:ind w:left="2160" w:hanging="360"/>
+      </w:pPr>
+      <w:rPr>
+        <w:rFonts w:ascii="Wingdings" w:hAnsi="Wingdings" w:hint="default"/>
+      </w:rPr>
+    </w:lvl>
+    <w:lvl w:ilvl="3" w:tplc="04090001" w:tentative="1">
+      <w:start w:val="1"/>
+      <w:numFmt w:val="bullet"/>
+      <w:lvlText w:val=""/>
+      <w:lvlJc w:val="left"/>
+      <w:pPr>
+        <w:ind w:left="2880" w:hanging="360"/>
+      </w:pPr>
+      <w:rPr>
+        <w:rFonts w:ascii="Symbol" w:hAnsi="Symbol" w:hint="default"/>
+      </w:rPr>
+    </w:lvl>
+    <w:lvl w:ilvl="4" w:tplc="04090003" w:tentative="1">
+      <w:start w:val="1"/>
+      <w:numFmt w:val="bullet"/>
+      <w:lvlText w:val="o"/>
+      <w:lvlJc w:val="left"/>
+      <w:pPr>
+        <w:ind w:left="3600" w:hanging="360"/>
+      </w:pPr>
+      <w:rPr>
+        <w:rFonts w:ascii="Courier New" w:hAnsi="Courier New" w:cs="Courier New" w:hint="default"/>
+      </w:rPr>
+    </w:lvl>
+    <w:lvl w:ilvl="5" w:tplc="04090005" w:tentative="1">
+      <w:start w:val="1"/>
+      <w:numFmt w:val="bullet"/>
+      <w:lvlText w:val=""/>
+      <w:lvlJc w:val="left"/>
+      <w:pPr>
+        <w:ind w:left="4320" w:hanging="360"/>
+      </w:pPr>
+      <w:rPr>
+        <w:rFonts w:ascii="Wingdings" w:hAnsi="Wingdings" w:hint="default"/>
+      </w:rPr>
+    </w:lvl>
+    <w:lvl w:ilvl="6" w:tplc="04090001" w:tentative="1">
+      <w:start w:val="1"/>
+      <w:numFmt w:val="bullet"/>
+      <w:lvlText w:val=""/>
+      <w:lvlJc w:val="left"/>
+      <w:pPr>
+        <w:ind w:left="5040" w:hanging="360"/>
+      </w:pPr>
+      <w:rPr>
+        <w:rFonts w:ascii="Symbol" w:hAnsi="Symbol" w:hint="default"/>
+      </w:rPr>
+    </w:lvl>
+    <w:lvl w:ilvl="7" w:tplc="04090003" w:tentative="1">
+      <w:start w:val="1"/>
+      <w:numFmt w:val="bullet"/>
+      <w:lvlText w:val="o"/>
+      <w:lvlJc w:val="left"/>
+      <w:pPr>
+        <w:ind w:left="5760" w:hanging="360"/>
+      </w:pPr>
+      <w:rPr>
+        <w:rFonts w:ascii="Courier New" w:hAnsi="Courier New" w:cs="Courier New" w:hint="default"/>
+      </w:rPr>
+    </w:lvl>
+    <w:lvl w:ilvl="8" w:tplc="04090005" w:tentative="1">
+      <w:start w:val="1"/>
+      <w:numFmt w:val="bullet"/>
+      <w:lvlText w:val=""/>
+      <w:lvlJc w:val="left"/>
+      <w:pPr>
+        <w:ind w:left="6480" w:hanging="360"/>
+      </w:pPr>
+      <w:rPr>
+        <w:rFonts w:ascii="Wingdings" w:hAnsi="Wingdings" w:hint="default"/>
+      </w:rPr>
+    </w:lvl>
+  </w:abstractNum>
+  <w:abstractNum w:abstractNumId="9">
+    <w:nsid w:val="54EE026F"/>
+    <w:multiLevelType w:val="hybridMultilevel"/>
+    <w:tmpl w:val="03D2E6C4"/>
+    <w:lvl w:ilvl="0" w:tplc="0409000F">
+      <w:start w:val="1"/>
+      <w:numFmt w:val="decimal"/>
+      <w:lvlText w:val="%1."/>
+      <w:lvlJc w:val="left"/>
+      <w:pPr>
+        <w:ind w:left="720" w:hanging="360"/>
+      </w:pPr>
+    </w:lvl>
+    <w:lvl w:ilvl="1" w:tplc="04090019" w:tentative="1">
+      <w:start w:val="1"/>
+      <w:numFmt w:val="lowerLetter"/>
+      <w:lvlText w:val="%2."/>
+      <w:lvlJc w:val="left"/>
+      <w:pPr>
+        <w:ind w:left="1440" w:hanging="360"/>
+      </w:pPr>
+    </w:lvl>
+    <w:lvl w:ilvl="2" w:tplc="0409001B" w:tentative="1">
+      <w:start w:val="1"/>
+      <w:numFmt w:val="lowerRoman"/>
+      <w:lvlText w:val="%3."/>
+      <w:lvlJc w:val="right"/>
+      <w:pPr>
+        <w:ind w:left="2160" w:hanging="180"/>
+      </w:pPr>
+    </w:lvl>
+    <w:lvl w:ilvl="3" w:tplc="0409000F" w:tentative="1">
+      <w:start w:val="1"/>
+      <w:numFmt w:val="decimal"/>
+      <w:lvlText w:val="%4."/>
+      <w:lvlJc w:val="left"/>
+      <w:pPr>
+        <w:ind w:left="2880" w:hanging="360"/>
+      </w:pPr>
+    </w:lvl>
+    <w:lvl w:ilvl="4" w:tplc="04090019" w:tentative="1">
+      <w:start w:val="1"/>
+      <w:numFmt w:val="lowerLetter"/>
+      <w:lvlText w:val="%5."/>
+      <w:lvlJc w:val="left"/>
+      <w:pPr>
+        <w:ind w:left="3600" w:hanging="360"/>
+      </w:pPr>
+    </w:lvl>
+    <w:lvl w:ilvl="5" w:tplc="0409001B" w:tentative="1">
+      <w:start w:val="1"/>
+      <w:numFmt w:val="lowerRoman"/>
+      <w:lvlText w:val="%6."/>
+      <w:lvlJc w:val="right"/>
+      <w:pPr>
+        <w:ind w:left="4320" w:hanging="180"/>
+      </w:pPr>
+    </w:lvl>
+    <w:lvl w:ilvl="6" w:tplc="0409000F" w:tentative="1">
+      <w:start w:val="1"/>
+      <w:numFmt w:val="decimal"/>
+      <w:lvlText w:val="%7."/>
+      <w:lvlJc w:val="left"/>
+      <w:pPr>
+        <w:ind w:left="5040" w:hanging="360"/>
+      </w:pPr>
+    </w:lvl>
+    <w:lvl w:ilvl="7" w:tplc="04090019" w:tentative="1">
+      <w:start w:val="1"/>
+      <w:numFmt w:val="lowerLetter"/>
+      <w:lvlText w:val="%8."/>
+      <w:lvlJc w:val="left"/>
+      <w:pPr>
+        <w:ind w:left="5760" w:hanging="360"/>
+      </w:pPr>
+    </w:lvl>
+    <w:lvl w:ilvl="8" w:tplc="0409001B" w:tentative="1">
+      <w:start w:val="1"/>
+      <w:numFmt w:val="lowerRoman"/>
+      <w:lvlText w:val="%9."/>
+      <w:lvlJc w:val="right"/>
+      <w:pPr>
+        <w:ind w:left="6480" w:hanging="180"/>
+      </w:pPr>
+    </w:lvl>
+  </w:abstractNum>
+  <w:abstractNum w:abstractNumId="10">
+    <w:nsid w:val="58DF2D82"/>
+    <w:multiLevelType w:val="hybridMultilevel"/>
+    <w:tmpl w:val="2B3C1BAE"/>
+    <w:lvl w:ilvl="0" w:tplc="04090001">
+      <w:start w:val="1"/>
+      <w:numFmt w:val="bullet"/>
+      <w:lvlText w:val=""/>
+      <w:lvlJc w:val="left"/>
+      <w:pPr>
+        <w:ind w:left="720" w:hanging="360"/>
+      </w:pPr>
+      <w:rPr>
+        <w:rFonts w:ascii="Symbol" w:hAnsi="Symbol" w:hint="default"/>
+      </w:rPr>
+    </w:lvl>
+    <w:lvl w:ilvl="1" w:tplc="04090003">
+      <w:start w:val="1"/>
+      <w:numFmt w:val="bullet"/>
+      <w:lvlText w:val="o"/>
+      <w:lvlJc w:val="left"/>
+      <w:pPr>
+        <w:ind w:left="1440" w:hanging="360"/>
+      </w:pPr>
+      <w:rPr>
+        <w:rFonts w:ascii="Courier New" w:hAnsi="Courier New" w:cs="Courier New" w:hint="default"/>
+      </w:rPr>
+    </w:lvl>
+    <w:lvl w:ilvl="2" w:tplc="04090005" w:tentative="1">
+      <w:start w:val="1"/>
+      <w:numFmt w:val="bullet"/>
+      <w:lvlText w:val=""/>
+      <w:lvlJc w:val="left"/>
+      <w:pPr>
+        <w:ind w:left="2160" w:hanging="360"/>
+      </w:pPr>
+      <w:rPr>
+        <w:rFonts w:ascii="Wingdings" w:hAnsi="Wingdings" w:hint="default"/>
+      </w:rPr>
+    </w:lvl>
+    <w:lvl w:ilvl="3" w:tplc="04090001" w:tentative="1">
+      <w:start w:val="1"/>
+      <w:numFmt w:val="bullet"/>
+      <w:lvlText w:val=""/>
+      <w:lvlJc w:val="left"/>
+      <w:pPr>
+        <w:ind w:left="2880" w:hanging="360"/>
+      </w:pPr>
+      <w:rPr>
+        <w:rFonts w:ascii="Symbol" w:hAnsi="Symbol" w:hint="default"/>
+      </w:rPr>
+    </w:lvl>
+    <w:lvl w:ilvl="4" w:tplc="04090003" w:tentative="1">
+      <w:start w:val="1"/>
+      <w:numFmt w:val="bullet"/>
+      <w:lvlText w:val="o"/>
+      <w:lvlJc w:val="left"/>
+      <w:pPr>
+        <w:ind w:left="3600" w:hanging="360"/>
+      </w:pPr>
+      <w:rPr>
+        <w:rFonts w:ascii="Courier New" w:hAnsi="Courier New" w:cs="Courier New" w:hint="default"/>
+      </w:rPr>
+    </w:lvl>
+    <w:lvl w:ilvl="5" w:tplc="04090005" w:tentative="1">
+      <w:start w:val="1"/>
+      <w:numFmt w:val="bullet"/>
+      <w:lvlText w:val=""/>
+      <w:lvlJc w:val="left"/>
+      <w:pPr>
+        <w:ind w:left="4320" w:hanging="360"/>
+      </w:pPr>
+      <w:rPr>
+        <w:rFonts w:ascii="Wingdings" w:hAnsi="Wingdings" w:hint="default"/>
+      </w:rPr>
+    </w:lvl>
+    <w:lvl w:ilvl="6" w:tplc="04090001" w:tentative="1">
+      <w:start w:val="1"/>
+      <w:numFmt w:val="bullet"/>
+      <w:lvlText w:val=""/>
+      <w:lvlJc w:val="left"/>
+      <w:pPr>
+        <w:ind w:left="5040" w:hanging="360"/>
+      </w:pPr>
+      <w:rPr>
+        <w:rFonts w:ascii="Symbol" w:hAnsi="Symbol" w:hint="default"/>
+      </w:rPr>
+    </w:lvl>
+    <w:lvl w:ilvl="7" w:tplc="04090003" w:tentative="1">
+      <w:start w:val="1"/>
+      <w:numFmt w:val="bullet"/>
+      <w:lvlText w:val="o"/>
+      <w:lvlJc w:val="left"/>
+      <w:pPr>
+        <w:ind w:left="5760" w:hanging="360"/>
+      </w:pPr>
+      <w:rPr>
+        <w:rFonts w:ascii="Courier New" w:hAnsi="Courier New" w:cs="Courier New" w:hint="default"/>
+      </w:rPr>
+    </w:lvl>
+    <w:lvl w:ilvl="8" w:tplc="04090005" w:tentative="1">
+      <w:start w:val="1"/>
+      <w:numFmt w:val="bullet"/>
+      <w:lvlText w:val=""/>
+      <w:lvlJc w:val="left"/>
+      <w:pPr>
+        <w:ind w:left="6480" w:hanging="360"/>
+      </w:pPr>
+      <w:rPr>
+        <w:rFonts w:ascii="Wingdings" w:hAnsi="Wingdings" w:hint="default"/>
+      </w:rPr>
+    </w:lvl>
+  </w:abstractNum>
+  <w:abstractNum w:abstractNumId="11">
+    <w:nsid w:val="67FC7957"/>
+    <w:multiLevelType w:val="hybridMultilevel"/>
+    <w:tmpl w:val="BD2CCF10"/>
+    <w:lvl w:ilvl="0" w:tplc="04090001">
+      <w:start w:val="1"/>
+      <w:numFmt w:val="bullet"/>
+      <w:lvlText w:val=""/>
+      <w:lvlJc w:val="left"/>
+      <w:pPr>
+        <w:ind w:left="720" w:hanging="360"/>
+      </w:pPr>
+      <w:rPr>
+        <w:rFonts w:ascii="Symbol" w:hAnsi="Symbol" w:hint="default"/>
+      </w:rPr>
+    </w:lvl>
+    <w:lvl w:ilvl="1" w:tplc="04090003">
+      <w:start w:val="1"/>
+      <w:numFmt w:val="bullet"/>
+      <w:lvlText w:val="o"/>
+      <w:lvlJc w:val="left"/>
+      <w:pPr>
+        <w:ind w:left="1440" w:hanging="360"/>
+      </w:pPr>
+      <w:rPr>
+        <w:rFonts w:ascii="Courier New" w:hAnsi="Courier New" w:cs="Courier New" w:hint="default"/>
+      </w:rPr>
+    </w:lvl>
+    <w:lvl w:ilvl="2" w:tplc="04090005">
+      <w:start w:val="1"/>
+      <w:numFmt w:val="bullet"/>
+      <w:lvlText w:val=""/>
+      <w:lvlJc w:val="left"/>
+      <w:pPr>
+        <w:ind w:left="2160" w:hanging="360"/>
+      </w:pPr>
+      <w:rPr>
+        <w:rFonts w:ascii="Wingdings" w:hAnsi="Wingdings" w:hint="default"/>
+      </w:rPr>
+    </w:lvl>
+    <w:lvl w:ilvl="3" w:tplc="04090001" w:tentative="1">
+      <w:start w:val="1"/>
+      <w:numFmt w:val="bullet"/>
+      <w:lvlText w:val=""/>
+      <w:lvlJc w:val="left"/>
+      <w:pPr>
+        <w:ind w:left="2880" w:hanging="360"/>
+      </w:pPr>
+      <w:rPr>
+        <w:rFonts w:ascii="Symbol" w:hAnsi="Symbol" w:hint="default"/>
+      </w:rPr>
+    </w:lvl>
+    <w:lvl w:ilvl="4" w:tplc="04090003" w:tentative="1">
+      <w:start w:val="1"/>
+      <w:numFmt w:val="bullet"/>
+      <w:lvlText w:val="o"/>
+      <w:lvlJc w:val="left"/>
+      <w:pPr>
+        <w:ind w:left="3600" w:hanging="360"/>
+      </w:pPr>
+      <w:rPr>
+        <w:rFonts w:ascii="Courier New" w:hAnsi="Courier New" w:cs="Courier New" w:hint="default"/>
+      </w:rPr>
+    </w:lvl>
+    <w:lvl w:ilvl="5" w:tplc="04090005" w:tentative="1">
+      <w:start w:val="1"/>
+      <w:numFmt w:val="bullet"/>
+      <w:lvlText w:val=""/>
+      <w:lvlJc w:val="left"/>
+      <w:pPr>
+        <w:ind w:left="4320" w:hanging="360"/>
+      </w:pPr>
+      <w:rPr>
+        <w:rFonts w:ascii="Wingdings" w:hAnsi="Wingdings" w:hint="default"/>
+      </w:rPr>
+    </w:lvl>
+    <w:lvl w:ilvl="6" w:tplc="04090001" w:tentative="1">
+      <w:start w:val="1"/>
+      <w:numFmt w:val="bullet"/>
+      <w:lvlText w:val=""/>
+      <w:lvlJc w:val="left"/>
+      <w:pPr>
+        <w:ind w:left="5040" w:hanging="360"/>
+      </w:pPr>
+      <w:rPr>
+        <w:rFonts w:ascii="Symbol" w:hAnsi="Symbol" w:hint="default"/>
+      </w:rPr>
+    </w:lvl>
+    <w:lvl w:ilvl="7" w:tplc="04090003" w:tentative="1">
+      <w:start w:val="1"/>
+      <w:numFmt w:val="bullet"/>
+      <w:lvlText w:val="o"/>
+      <w:lvlJc w:val="left"/>
+      <w:pPr>
+        <w:ind w:left="5760" w:hanging="360"/>
+      </w:pPr>
+      <w:rPr>
+        <w:rFonts w:ascii="Courier New" w:hAnsi="Courier New" w:cs="Courier New" w:hint="default"/>
+      </w:rPr>
+    </w:lvl>
+    <w:lvl w:ilvl="8" w:tplc="04090005" w:tentative="1">
+      <w:start w:val="1"/>
+      <w:numFmt w:val="bullet"/>
+      <w:lvlText w:val=""/>
+      <w:lvlJc w:val="left"/>
+      <w:pPr>
+        <w:ind w:left="6480" w:hanging="360"/>
+      </w:pPr>
+      <w:rPr>
+        <w:rFonts w:ascii="Wingdings" w:hAnsi="Wingdings" w:hint="default"/>
+      </w:rPr>
+    </w:lvl>
+  </w:abstractNum>
+  <w:num w:numId="1">
+    <w:abstractNumId w:val="5"/>
+  </w:num>
+  <w:num w:numId="2">
+    <w:abstractNumId w:val="0"/>
+  </w:num>
+  <w:num w:numId="3">
+    <w:abstractNumId w:val="9"/>
+  </w:num>
+  <w:num w:numId="4">
+    <w:abstractNumId w:val="6"/>
+  </w:num>
+  <w:num w:numId="5">
+    <w:abstractNumId w:val="4"/>
+  </w:num>
+  <w:num w:numId="6">
+    <w:abstractNumId w:val="7"/>
+  </w:num>
+  <w:num w:numId="7">
+    <w:abstractNumId w:val="8"/>
+  </w:num>
+  <w:num w:numId="8">
+    <w:abstractNumId w:val="1"/>
+  </w:num>
+  <w:num w:numId="9">
+    <w:abstractNumId w:val="10"/>
+  </w:num>
+  <w:num w:numId="10">
+    <w:abstractNumId w:val="3"/>
+  </w:num>
+  <w:num w:numId="11">
+    <w:abstractNumId w:val="11"/>
+  </w:num>
+  <w:num w:numId="12">
+    <w:abstractNumId w:val="2"/>
+  </w:num>
+</w:numbering>
 </file>
 
 <file path=word/styles.xml><?xml version="1.0" encoding="utf-8"?>
@@ -1644,6 +5045,52 @@
       <w:color w:val="365F91" w:themeColor="accent1" w:themeShade="BF"/>
       <w:sz w:val="28"/>
       <w:szCs w:val="28"/>
+    </w:rPr>
+  </w:style>
+  <w:style w:type="paragraph" w:styleId="Heading2">
+    <w:name w:val="heading 2"/>
+    <w:basedOn w:val="Normal"/>
+    <w:next w:val="Normal"/>
+    <w:link w:val="Heading2Char"/>
+    <w:uiPriority w:val="9"/>
+    <w:unhideWhenUsed/>
+    <w:qFormat/>
+    <w:rsid w:val="00033D20"/>
+    <w:pPr>
+      <w:keepNext/>
+      <w:keepLines/>
+      <w:spacing w:before="200" w:after="0"/>
+      <w:outlineLvl w:val="1"/>
+    </w:pPr>
+    <w:rPr>
+      <w:rFonts w:asciiTheme="majorHAnsi" w:eastAsiaTheme="majorEastAsia" w:hAnsiTheme="majorHAnsi" w:cstheme="majorBidi"/>
+      <w:b/>
+      <w:bCs/>
+      <w:color w:val="4F81BD" w:themeColor="accent1"/>
+      <w:sz w:val="26"/>
+      <w:szCs w:val="26"/>
+    </w:rPr>
+  </w:style>
+  <w:style w:type="paragraph" w:styleId="Heading3">
+    <w:name w:val="heading 3"/>
+    <w:basedOn w:val="Normal"/>
+    <w:next w:val="Normal"/>
+    <w:link w:val="Heading3Char"/>
+    <w:uiPriority w:val="9"/>
+    <w:unhideWhenUsed/>
+    <w:qFormat/>
+    <w:rsid w:val="00F016A3"/>
+    <w:pPr>
+      <w:keepNext/>
+      <w:keepLines/>
+      <w:spacing w:before="200" w:after="0"/>
+      <w:outlineLvl w:val="2"/>
+    </w:pPr>
+    <w:rPr>
+      <w:rFonts w:asciiTheme="majorHAnsi" w:eastAsiaTheme="majorEastAsia" w:hAnsiTheme="majorHAnsi" w:cstheme="majorBidi"/>
+      <w:b/>
+      <w:bCs/>
+      <w:color w:val="4F81BD" w:themeColor="accent1"/>
     </w:rPr>
   </w:style>
   <w:style w:type="character" w:default="1" w:styleId="DefaultParagraphFont">
@@ -1954,6 +5401,71 @@
       <w:u w:val="single"/>
     </w:rPr>
   </w:style>
+  <w:style w:type="character" w:customStyle="1" w:styleId="Heading2Char">
+    <w:name w:val="Heading 2 Char"/>
+    <w:basedOn w:val="DefaultParagraphFont"/>
+    <w:link w:val="Heading2"/>
+    <w:uiPriority w:val="9"/>
+    <w:rsid w:val="00033D20"/>
+    <w:rPr>
+      <w:rFonts w:asciiTheme="majorHAnsi" w:eastAsiaTheme="majorEastAsia" w:hAnsiTheme="majorHAnsi" w:cstheme="majorBidi"/>
+      <w:b/>
+      <w:bCs/>
+      <w:color w:val="4F81BD" w:themeColor="accent1"/>
+      <w:sz w:val="26"/>
+      <w:szCs w:val="26"/>
+    </w:rPr>
+  </w:style>
+  <w:style w:type="paragraph" w:styleId="ListParagraph">
+    <w:name w:val="List Paragraph"/>
+    <w:basedOn w:val="Normal"/>
+    <w:uiPriority w:val="34"/>
+    <w:qFormat/>
+    <w:rsid w:val="00F016A3"/>
+    <w:pPr>
+      <w:ind w:left="720"/>
+      <w:contextualSpacing/>
+    </w:pPr>
+  </w:style>
+  <w:style w:type="character" w:customStyle="1" w:styleId="Heading3Char">
+    <w:name w:val="Heading 3 Char"/>
+    <w:basedOn w:val="DefaultParagraphFont"/>
+    <w:link w:val="Heading3"/>
+    <w:uiPriority w:val="9"/>
+    <w:rsid w:val="00F016A3"/>
+    <w:rPr>
+      <w:rFonts w:asciiTheme="majorHAnsi" w:eastAsiaTheme="majorEastAsia" w:hAnsiTheme="majorHAnsi" w:cstheme="majorBidi"/>
+      <w:b/>
+      <w:bCs/>
+      <w:color w:val="4F81BD" w:themeColor="accent1"/>
+    </w:rPr>
+  </w:style>
+  <w:style w:type="paragraph" w:styleId="TOC2">
+    <w:name w:val="toc 2"/>
+    <w:basedOn w:val="Normal"/>
+    <w:next w:val="Normal"/>
+    <w:autoRedefine/>
+    <w:uiPriority w:val="39"/>
+    <w:unhideWhenUsed/>
+    <w:rsid w:val="00761871"/>
+    <w:pPr>
+      <w:spacing w:after="100"/>
+      <w:ind w:left="220"/>
+    </w:pPr>
+  </w:style>
+  <w:style w:type="paragraph" w:styleId="TOC3">
+    <w:name w:val="toc 3"/>
+    <w:basedOn w:val="Normal"/>
+    <w:next w:val="Normal"/>
+    <w:autoRedefine/>
+    <w:uiPriority w:val="39"/>
+    <w:unhideWhenUsed/>
+    <w:rsid w:val="00761871"/>
+    <w:pPr>
+      <w:spacing w:after="100"/>
+      <w:ind w:left="440"/>
+    </w:pPr>
+  </w:style>
 </w:styles>
 </file>
 
@@ -2139,6 +5651,52 @@
       <w:color w:val="365F91" w:themeColor="accent1" w:themeShade="BF"/>
       <w:sz w:val="28"/>
       <w:szCs w:val="28"/>
+    </w:rPr>
+  </w:style>
+  <w:style w:type="paragraph" w:styleId="Heading2">
+    <w:name w:val="heading 2"/>
+    <w:basedOn w:val="Normal"/>
+    <w:next w:val="Normal"/>
+    <w:link w:val="Heading2Char"/>
+    <w:uiPriority w:val="9"/>
+    <w:unhideWhenUsed/>
+    <w:qFormat/>
+    <w:rsid w:val="00033D20"/>
+    <w:pPr>
+      <w:keepNext/>
+      <w:keepLines/>
+      <w:spacing w:before="200" w:after="0"/>
+      <w:outlineLvl w:val="1"/>
+    </w:pPr>
+    <w:rPr>
+      <w:rFonts w:asciiTheme="majorHAnsi" w:eastAsiaTheme="majorEastAsia" w:hAnsiTheme="majorHAnsi" w:cstheme="majorBidi"/>
+      <w:b/>
+      <w:bCs/>
+      <w:color w:val="4F81BD" w:themeColor="accent1"/>
+      <w:sz w:val="26"/>
+      <w:szCs w:val="26"/>
+    </w:rPr>
+  </w:style>
+  <w:style w:type="paragraph" w:styleId="Heading3">
+    <w:name w:val="heading 3"/>
+    <w:basedOn w:val="Normal"/>
+    <w:next w:val="Normal"/>
+    <w:link w:val="Heading3Char"/>
+    <w:uiPriority w:val="9"/>
+    <w:unhideWhenUsed/>
+    <w:qFormat/>
+    <w:rsid w:val="00F016A3"/>
+    <w:pPr>
+      <w:keepNext/>
+      <w:keepLines/>
+      <w:spacing w:before="200" w:after="0"/>
+      <w:outlineLvl w:val="2"/>
+    </w:pPr>
+    <w:rPr>
+      <w:rFonts w:asciiTheme="majorHAnsi" w:eastAsiaTheme="majorEastAsia" w:hAnsiTheme="majorHAnsi" w:cstheme="majorBidi"/>
+      <w:b/>
+      <w:bCs/>
+      <w:color w:val="4F81BD" w:themeColor="accent1"/>
     </w:rPr>
   </w:style>
   <w:style w:type="character" w:default="1" w:styleId="DefaultParagraphFont">
@@ -2448,6 +6006,71 @@
       <w:color w:val="0000FF" w:themeColor="hyperlink"/>
       <w:u w:val="single"/>
     </w:rPr>
+  </w:style>
+  <w:style w:type="character" w:customStyle="1" w:styleId="Heading2Char">
+    <w:name w:val="Heading 2 Char"/>
+    <w:basedOn w:val="DefaultParagraphFont"/>
+    <w:link w:val="Heading2"/>
+    <w:uiPriority w:val="9"/>
+    <w:rsid w:val="00033D20"/>
+    <w:rPr>
+      <w:rFonts w:asciiTheme="majorHAnsi" w:eastAsiaTheme="majorEastAsia" w:hAnsiTheme="majorHAnsi" w:cstheme="majorBidi"/>
+      <w:b/>
+      <w:bCs/>
+      <w:color w:val="4F81BD" w:themeColor="accent1"/>
+      <w:sz w:val="26"/>
+      <w:szCs w:val="26"/>
+    </w:rPr>
+  </w:style>
+  <w:style w:type="paragraph" w:styleId="ListParagraph">
+    <w:name w:val="List Paragraph"/>
+    <w:basedOn w:val="Normal"/>
+    <w:uiPriority w:val="34"/>
+    <w:qFormat/>
+    <w:rsid w:val="00F016A3"/>
+    <w:pPr>
+      <w:ind w:left="720"/>
+      <w:contextualSpacing/>
+    </w:pPr>
+  </w:style>
+  <w:style w:type="character" w:customStyle="1" w:styleId="Heading3Char">
+    <w:name w:val="Heading 3 Char"/>
+    <w:basedOn w:val="DefaultParagraphFont"/>
+    <w:link w:val="Heading3"/>
+    <w:uiPriority w:val="9"/>
+    <w:rsid w:val="00F016A3"/>
+    <w:rPr>
+      <w:rFonts w:asciiTheme="majorHAnsi" w:eastAsiaTheme="majorEastAsia" w:hAnsiTheme="majorHAnsi" w:cstheme="majorBidi"/>
+      <w:b/>
+      <w:bCs/>
+      <w:color w:val="4F81BD" w:themeColor="accent1"/>
+    </w:rPr>
+  </w:style>
+  <w:style w:type="paragraph" w:styleId="TOC2">
+    <w:name w:val="toc 2"/>
+    <w:basedOn w:val="Normal"/>
+    <w:next w:val="Normal"/>
+    <w:autoRedefine/>
+    <w:uiPriority w:val="39"/>
+    <w:unhideWhenUsed/>
+    <w:rsid w:val="00761871"/>
+    <w:pPr>
+      <w:spacing w:after="100"/>
+      <w:ind w:left="220"/>
+    </w:pPr>
+  </w:style>
+  <w:style w:type="paragraph" w:styleId="TOC3">
+    <w:name w:val="toc 3"/>
+    <w:basedOn w:val="Normal"/>
+    <w:next w:val="Normal"/>
+    <w:autoRedefine/>
+    <w:uiPriority w:val="39"/>
+    <w:unhideWhenUsed/>
+    <w:rsid w:val="00761871"/>
+    <w:pPr>
+      <w:spacing w:after="100"/>
+      <w:ind w:left="440"/>
+    </w:pPr>
   </w:style>
 </w:styles>
 </file>
@@ -2742,7 +6365,7 @@
 </file>
 
 <file path=customXml/itemProps1.xml><?xml version="1.0" encoding="utf-8"?>
-<ds:datastoreItem xmlns:ds="http://schemas.openxmlformats.org/officeDocument/2006/customXml" ds:itemID="{D340D9E5-1D75-43E8-8562-AA3B16880DF8}">
+<ds:datastoreItem xmlns:ds="http://schemas.openxmlformats.org/officeDocument/2006/customXml" ds:itemID="{B651657C-2439-4E1F-B7B1-E6A8D5ACDFDE}">
   <ds:schemaRefs>
     <ds:schemaRef ds:uri="http://schemas.openxmlformats.org/officeDocument/2006/bibliography"/>
   </ds:schemaRefs>

</xml_diff>